<commit_message>
Final changes to Documentation
</commit_message>
<xml_diff>
--- a/Project_Documentation.docx
+++ b/Project_Documentation.docx
@@ -145,7 +145,11 @@
           </w:pPr>
           <w:r>
             <w:fldChar w:fldCharType="begin"/>
+          </w:r>
+          <w:r>
             <w:instrText>TOC \h \o "1-3"</w:instrText>
+          </w:r>
+          <w:r>
             <w:fldChar w:fldCharType="separate"/>
           </w:r>
           <w:hyperlink w:anchor="_Toc233174880" w:history="1">
@@ -161,10 +165,40 @@
                 <w:noProof/>
               </w:rPr>
               <w:tab/>
+            </w:r>
+            <w:r>
+              <w:rPr>
+                <w:noProof/>
+              </w:rPr>
               <w:fldChar w:fldCharType="begin"/>
+            </w:r>
+            <w:r>
+              <w:rPr>
+                <w:noProof/>
+              </w:rPr>
               <w:instrText xml:space="preserve"> PAGEREF _Toc233174880 \h </w:instrText>
+            </w:r>
+            <w:r>
+              <w:rPr>
+                <w:noProof/>
+              </w:rPr>
+            </w:r>
+            <w:r>
+              <w:rPr>
+                <w:noProof/>
+              </w:rPr>
               <w:fldChar w:fldCharType="separate"/>
+            </w:r>
+            <w:r>
+              <w:rPr>
+                <w:noProof/>
+              </w:rPr>
               <w:t>2</w:t>
+            </w:r>
+            <w:r>
+              <w:rPr>
+                <w:noProof/>
+              </w:rPr>
               <w:fldChar w:fldCharType="end"/>
             </w:r>
           </w:hyperlink>
@@ -192,10 +226,40 @@
                 <w:noProof/>
               </w:rPr>
               <w:tab/>
+            </w:r>
+            <w:r>
+              <w:rPr>
+                <w:noProof/>
+              </w:rPr>
               <w:fldChar w:fldCharType="begin"/>
+            </w:r>
+            <w:r>
+              <w:rPr>
+                <w:noProof/>
+              </w:rPr>
               <w:instrText xml:space="preserve"> PAGEREF _Toc233174881 \h </w:instrText>
+            </w:r>
+            <w:r>
+              <w:rPr>
+                <w:noProof/>
+              </w:rPr>
+            </w:r>
+            <w:r>
+              <w:rPr>
+                <w:noProof/>
+              </w:rPr>
               <w:fldChar w:fldCharType="separate"/>
+            </w:r>
+            <w:r>
+              <w:rPr>
+                <w:noProof/>
+              </w:rPr>
               <w:t>4</w:t>
+            </w:r>
+            <w:r>
+              <w:rPr>
+                <w:noProof/>
+              </w:rPr>
               <w:fldChar w:fldCharType="end"/>
             </w:r>
           </w:hyperlink>
@@ -223,10 +287,40 @@
                 <w:noProof/>
               </w:rPr>
               <w:tab/>
+            </w:r>
+            <w:r>
+              <w:rPr>
+                <w:noProof/>
+              </w:rPr>
               <w:fldChar w:fldCharType="begin"/>
+            </w:r>
+            <w:r>
+              <w:rPr>
+                <w:noProof/>
+              </w:rPr>
               <w:instrText xml:space="preserve"> PAGEREF _Toc233174882 \h </w:instrText>
+            </w:r>
+            <w:r>
+              <w:rPr>
+                <w:noProof/>
+              </w:rPr>
+            </w:r>
+            <w:r>
+              <w:rPr>
+                <w:noProof/>
+              </w:rPr>
               <w:fldChar w:fldCharType="separate"/>
+            </w:r>
+            <w:r>
+              <w:rPr>
+                <w:noProof/>
+              </w:rPr>
               <w:t>5</w:t>
+            </w:r>
+            <w:r>
+              <w:rPr>
+                <w:noProof/>
+              </w:rPr>
               <w:fldChar w:fldCharType="end"/>
             </w:r>
           </w:hyperlink>
@@ -254,10 +348,40 @@
                 <w:noProof/>
               </w:rPr>
               <w:tab/>
+            </w:r>
+            <w:r>
+              <w:rPr>
+                <w:noProof/>
+              </w:rPr>
               <w:fldChar w:fldCharType="begin"/>
+            </w:r>
+            <w:r>
+              <w:rPr>
+                <w:noProof/>
+              </w:rPr>
               <w:instrText xml:space="preserve"> PAGEREF _Toc233174883 \h </w:instrText>
+            </w:r>
+            <w:r>
+              <w:rPr>
+                <w:noProof/>
+              </w:rPr>
+            </w:r>
+            <w:r>
+              <w:rPr>
+                <w:noProof/>
+              </w:rPr>
               <w:fldChar w:fldCharType="separate"/>
+            </w:r>
+            <w:r>
+              <w:rPr>
+                <w:noProof/>
+              </w:rPr>
               <w:t>5</w:t>
+            </w:r>
+            <w:r>
+              <w:rPr>
+                <w:noProof/>
+              </w:rPr>
               <w:fldChar w:fldCharType="end"/>
             </w:r>
           </w:hyperlink>
@@ -285,10 +409,40 @@
                 <w:noProof/>
               </w:rPr>
               <w:tab/>
+            </w:r>
+            <w:r>
+              <w:rPr>
+                <w:noProof/>
+              </w:rPr>
               <w:fldChar w:fldCharType="begin"/>
+            </w:r>
+            <w:r>
+              <w:rPr>
+                <w:noProof/>
+              </w:rPr>
               <w:instrText xml:space="preserve"> PAGEREF _Toc233174884 \h </w:instrText>
+            </w:r>
+            <w:r>
+              <w:rPr>
+                <w:noProof/>
+              </w:rPr>
+            </w:r>
+            <w:r>
+              <w:rPr>
+                <w:noProof/>
+              </w:rPr>
               <w:fldChar w:fldCharType="separate"/>
+            </w:r>
+            <w:r>
+              <w:rPr>
+                <w:noProof/>
+              </w:rPr>
               <w:t>5</w:t>
+            </w:r>
+            <w:r>
+              <w:rPr>
+                <w:noProof/>
+              </w:rPr>
               <w:fldChar w:fldCharType="end"/>
             </w:r>
           </w:hyperlink>
@@ -316,10 +470,40 @@
                 <w:noProof/>
               </w:rPr>
               <w:tab/>
+            </w:r>
+            <w:r>
+              <w:rPr>
+                <w:noProof/>
+              </w:rPr>
               <w:fldChar w:fldCharType="begin"/>
+            </w:r>
+            <w:r>
+              <w:rPr>
+                <w:noProof/>
+              </w:rPr>
               <w:instrText xml:space="preserve"> PAGEREF _Toc233174885 \h </w:instrText>
+            </w:r>
+            <w:r>
+              <w:rPr>
+                <w:noProof/>
+              </w:rPr>
+            </w:r>
+            <w:r>
+              <w:rPr>
+                <w:noProof/>
+              </w:rPr>
               <w:fldChar w:fldCharType="separate"/>
+            </w:r>
+            <w:r>
+              <w:rPr>
+                <w:noProof/>
+              </w:rPr>
               <w:t>5</w:t>
+            </w:r>
+            <w:r>
+              <w:rPr>
+                <w:noProof/>
+              </w:rPr>
               <w:fldChar w:fldCharType="end"/>
             </w:r>
           </w:hyperlink>
@@ -347,10 +531,40 @@
                 <w:noProof/>
               </w:rPr>
               <w:tab/>
+            </w:r>
+            <w:r>
+              <w:rPr>
+                <w:noProof/>
+              </w:rPr>
               <w:fldChar w:fldCharType="begin"/>
+            </w:r>
+            <w:r>
+              <w:rPr>
+                <w:noProof/>
+              </w:rPr>
               <w:instrText xml:space="preserve"> PAGEREF _Toc233174886 \h </w:instrText>
+            </w:r>
+            <w:r>
+              <w:rPr>
+                <w:noProof/>
+              </w:rPr>
+            </w:r>
+            <w:r>
+              <w:rPr>
+                <w:noProof/>
+              </w:rPr>
               <w:fldChar w:fldCharType="separate"/>
+            </w:r>
+            <w:r>
+              <w:rPr>
+                <w:noProof/>
+              </w:rPr>
               <w:t>7</w:t>
+            </w:r>
+            <w:r>
+              <w:rPr>
+                <w:noProof/>
+              </w:rPr>
               <w:fldChar w:fldCharType="end"/>
             </w:r>
           </w:hyperlink>
@@ -378,10 +592,40 @@
                 <w:noProof/>
               </w:rPr>
               <w:tab/>
+            </w:r>
+            <w:r>
+              <w:rPr>
+                <w:noProof/>
+              </w:rPr>
               <w:fldChar w:fldCharType="begin"/>
+            </w:r>
+            <w:r>
+              <w:rPr>
+                <w:noProof/>
+              </w:rPr>
               <w:instrText xml:space="preserve"> PAGEREF _Toc233174887 \h </w:instrText>
+            </w:r>
+            <w:r>
+              <w:rPr>
+                <w:noProof/>
+              </w:rPr>
+            </w:r>
+            <w:r>
+              <w:rPr>
+                <w:noProof/>
+              </w:rPr>
               <w:fldChar w:fldCharType="separate"/>
+            </w:r>
+            <w:r>
+              <w:rPr>
+                <w:noProof/>
+              </w:rPr>
               <w:t>7</w:t>
+            </w:r>
+            <w:r>
+              <w:rPr>
+                <w:noProof/>
+              </w:rPr>
               <w:fldChar w:fldCharType="end"/>
             </w:r>
           </w:hyperlink>
@@ -409,10 +653,40 @@
                 <w:noProof/>
               </w:rPr>
               <w:tab/>
+            </w:r>
+            <w:r>
+              <w:rPr>
+                <w:noProof/>
+              </w:rPr>
               <w:fldChar w:fldCharType="begin"/>
+            </w:r>
+            <w:r>
+              <w:rPr>
+                <w:noProof/>
+              </w:rPr>
               <w:instrText xml:space="preserve"> PAGEREF _Toc233174888 \h </w:instrText>
+            </w:r>
+            <w:r>
+              <w:rPr>
+                <w:noProof/>
+              </w:rPr>
+            </w:r>
+            <w:r>
+              <w:rPr>
+                <w:noProof/>
+              </w:rPr>
               <w:fldChar w:fldCharType="separate"/>
+            </w:r>
+            <w:r>
+              <w:rPr>
+                <w:noProof/>
+              </w:rPr>
               <w:t>7</w:t>
+            </w:r>
+            <w:r>
+              <w:rPr>
+                <w:noProof/>
+              </w:rPr>
               <w:fldChar w:fldCharType="end"/>
             </w:r>
           </w:hyperlink>
@@ -440,10 +714,40 @@
                 <w:noProof/>
               </w:rPr>
               <w:tab/>
+            </w:r>
+            <w:r>
+              <w:rPr>
+                <w:noProof/>
+              </w:rPr>
               <w:fldChar w:fldCharType="begin"/>
+            </w:r>
+            <w:r>
+              <w:rPr>
+                <w:noProof/>
+              </w:rPr>
               <w:instrText xml:space="preserve"> PAGEREF _Toc233174889 \h </w:instrText>
+            </w:r>
+            <w:r>
+              <w:rPr>
+                <w:noProof/>
+              </w:rPr>
+            </w:r>
+            <w:r>
+              <w:rPr>
+                <w:noProof/>
+              </w:rPr>
               <w:fldChar w:fldCharType="separate"/>
+            </w:r>
+            <w:r>
+              <w:rPr>
+                <w:noProof/>
+              </w:rPr>
               <w:t>8</w:t>
+            </w:r>
+            <w:r>
+              <w:rPr>
+                <w:noProof/>
+              </w:rPr>
               <w:fldChar w:fldCharType="end"/>
             </w:r>
           </w:hyperlink>
@@ -471,10 +775,40 @@
                 <w:noProof/>
               </w:rPr>
               <w:tab/>
+            </w:r>
+            <w:r>
+              <w:rPr>
+                <w:noProof/>
+              </w:rPr>
               <w:fldChar w:fldCharType="begin"/>
+            </w:r>
+            <w:r>
+              <w:rPr>
+                <w:noProof/>
+              </w:rPr>
               <w:instrText xml:space="preserve"> PAGEREF _Toc233174890 \h </w:instrText>
+            </w:r>
+            <w:r>
+              <w:rPr>
+                <w:noProof/>
+              </w:rPr>
+            </w:r>
+            <w:r>
+              <w:rPr>
+                <w:noProof/>
+              </w:rPr>
               <w:fldChar w:fldCharType="separate"/>
+            </w:r>
+            <w:r>
+              <w:rPr>
+                <w:noProof/>
+              </w:rPr>
               <w:t>9</w:t>
+            </w:r>
+            <w:r>
+              <w:rPr>
+                <w:noProof/>
+              </w:rPr>
               <w:fldChar w:fldCharType="end"/>
             </w:r>
           </w:hyperlink>
@@ -502,10 +836,40 @@
                 <w:noProof/>
               </w:rPr>
               <w:tab/>
+            </w:r>
+            <w:r>
+              <w:rPr>
+                <w:noProof/>
+              </w:rPr>
               <w:fldChar w:fldCharType="begin"/>
+            </w:r>
+            <w:r>
+              <w:rPr>
+                <w:noProof/>
+              </w:rPr>
               <w:instrText xml:space="preserve"> PAGEREF _Toc233174891 \h </w:instrText>
+            </w:r>
+            <w:r>
+              <w:rPr>
+                <w:noProof/>
+              </w:rPr>
+            </w:r>
+            <w:r>
+              <w:rPr>
+                <w:noProof/>
+              </w:rPr>
               <w:fldChar w:fldCharType="separate"/>
+            </w:r>
+            <w:r>
+              <w:rPr>
+                <w:noProof/>
+              </w:rPr>
               <w:t>9</w:t>
+            </w:r>
+            <w:r>
+              <w:rPr>
+                <w:noProof/>
+              </w:rPr>
               <w:fldChar w:fldCharType="end"/>
             </w:r>
           </w:hyperlink>
@@ -533,10 +897,40 @@
                 <w:noProof/>
               </w:rPr>
               <w:tab/>
+            </w:r>
+            <w:r>
+              <w:rPr>
+                <w:noProof/>
+              </w:rPr>
               <w:fldChar w:fldCharType="begin"/>
+            </w:r>
+            <w:r>
+              <w:rPr>
+                <w:noProof/>
+              </w:rPr>
               <w:instrText xml:space="preserve"> PAGEREF _Toc233174892 \h </w:instrText>
+            </w:r>
+            <w:r>
+              <w:rPr>
+                <w:noProof/>
+              </w:rPr>
+            </w:r>
+            <w:r>
+              <w:rPr>
+                <w:noProof/>
+              </w:rPr>
               <w:fldChar w:fldCharType="separate"/>
+            </w:r>
+            <w:r>
+              <w:rPr>
+                <w:noProof/>
+              </w:rPr>
               <w:t>9</w:t>
+            </w:r>
+            <w:r>
+              <w:rPr>
+                <w:noProof/>
+              </w:rPr>
               <w:fldChar w:fldCharType="end"/>
             </w:r>
           </w:hyperlink>
@@ -564,10 +958,40 @@
                 <w:noProof/>
               </w:rPr>
               <w:tab/>
+            </w:r>
+            <w:r>
+              <w:rPr>
+                <w:noProof/>
+              </w:rPr>
               <w:fldChar w:fldCharType="begin"/>
+            </w:r>
+            <w:r>
+              <w:rPr>
+                <w:noProof/>
+              </w:rPr>
               <w:instrText xml:space="preserve"> PAGEREF _Toc233174893 \h </w:instrText>
+            </w:r>
+            <w:r>
+              <w:rPr>
+                <w:noProof/>
+              </w:rPr>
+            </w:r>
+            <w:r>
+              <w:rPr>
+                <w:noProof/>
+              </w:rPr>
               <w:fldChar w:fldCharType="separate"/>
+            </w:r>
+            <w:r>
+              <w:rPr>
+                <w:noProof/>
+              </w:rPr>
               <w:t>9</w:t>
+            </w:r>
+            <w:r>
+              <w:rPr>
+                <w:noProof/>
+              </w:rPr>
               <w:fldChar w:fldCharType="end"/>
             </w:r>
           </w:hyperlink>
@@ -595,10 +1019,40 @@
                 <w:noProof/>
               </w:rPr>
               <w:tab/>
+            </w:r>
+            <w:r>
+              <w:rPr>
+                <w:noProof/>
+              </w:rPr>
               <w:fldChar w:fldCharType="begin"/>
+            </w:r>
+            <w:r>
+              <w:rPr>
+                <w:noProof/>
+              </w:rPr>
               <w:instrText xml:space="preserve"> PAGEREF _Toc233174894 \h </w:instrText>
+            </w:r>
+            <w:r>
+              <w:rPr>
+                <w:noProof/>
+              </w:rPr>
+            </w:r>
+            <w:r>
+              <w:rPr>
+                <w:noProof/>
+              </w:rPr>
               <w:fldChar w:fldCharType="separate"/>
+            </w:r>
+            <w:r>
+              <w:rPr>
+                <w:noProof/>
+              </w:rPr>
               <w:t>11</w:t>
+            </w:r>
+            <w:r>
+              <w:rPr>
+                <w:noProof/>
+              </w:rPr>
               <w:fldChar w:fldCharType="end"/>
             </w:r>
           </w:hyperlink>
@@ -626,10 +1080,40 @@
                 <w:noProof/>
               </w:rPr>
               <w:tab/>
+            </w:r>
+            <w:r>
+              <w:rPr>
+                <w:noProof/>
+              </w:rPr>
               <w:fldChar w:fldCharType="begin"/>
+            </w:r>
+            <w:r>
+              <w:rPr>
+                <w:noProof/>
+              </w:rPr>
               <w:instrText xml:space="preserve"> PAGEREF _Toc233174895 \h </w:instrText>
+            </w:r>
+            <w:r>
+              <w:rPr>
+                <w:noProof/>
+              </w:rPr>
+            </w:r>
+            <w:r>
+              <w:rPr>
+                <w:noProof/>
+              </w:rPr>
               <w:fldChar w:fldCharType="separate"/>
+            </w:r>
+            <w:r>
+              <w:rPr>
+                <w:noProof/>
+              </w:rPr>
               <w:t>11</w:t>
+            </w:r>
+            <w:r>
+              <w:rPr>
+                <w:noProof/>
+              </w:rPr>
               <w:fldChar w:fldCharType="end"/>
             </w:r>
           </w:hyperlink>
@@ -657,10 +1141,40 @@
                 <w:noProof/>
               </w:rPr>
               <w:tab/>
+            </w:r>
+            <w:r>
+              <w:rPr>
+                <w:noProof/>
+              </w:rPr>
               <w:fldChar w:fldCharType="begin"/>
+            </w:r>
+            <w:r>
+              <w:rPr>
+                <w:noProof/>
+              </w:rPr>
               <w:instrText xml:space="preserve"> PAGEREF _Toc233174896 \h </w:instrText>
+            </w:r>
+            <w:r>
+              <w:rPr>
+                <w:noProof/>
+              </w:rPr>
+            </w:r>
+            <w:r>
+              <w:rPr>
+                <w:noProof/>
+              </w:rPr>
               <w:fldChar w:fldCharType="separate"/>
+            </w:r>
+            <w:r>
+              <w:rPr>
+                <w:noProof/>
+              </w:rPr>
               <w:t>11</w:t>
+            </w:r>
+            <w:r>
+              <w:rPr>
+                <w:noProof/>
+              </w:rPr>
               <w:fldChar w:fldCharType="end"/>
             </w:r>
           </w:hyperlink>
@@ -688,10 +1202,40 @@
                 <w:noProof/>
               </w:rPr>
               <w:tab/>
+            </w:r>
+            <w:r>
+              <w:rPr>
+                <w:noProof/>
+              </w:rPr>
               <w:fldChar w:fldCharType="begin"/>
+            </w:r>
+            <w:r>
+              <w:rPr>
+                <w:noProof/>
+              </w:rPr>
               <w:instrText xml:space="preserve"> PAGEREF _Toc233174897 \h </w:instrText>
+            </w:r>
+            <w:r>
+              <w:rPr>
+                <w:noProof/>
+              </w:rPr>
+            </w:r>
+            <w:r>
+              <w:rPr>
+                <w:noProof/>
+              </w:rPr>
               <w:fldChar w:fldCharType="separate"/>
+            </w:r>
+            <w:r>
+              <w:rPr>
+                <w:noProof/>
+              </w:rPr>
               <w:t>13</w:t>
+            </w:r>
+            <w:r>
+              <w:rPr>
+                <w:noProof/>
+              </w:rPr>
               <w:fldChar w:fldCharType="end"/>
             </w:r>
           </w:hyperlink>
@@ -719,10 +1263,40 @@
                 <w:noProof/>
               </w:rPr>
               <w:tab/>
+            </w:r>
+            <w:r>
+              <w:rPr>
+                <w:noProof/>
+              </w:rPr>
               <w:fldChar w:fldCharType="begin"/>
+            </w:r>
+            <w:r>
+              <w:rPr>
+                <w:noProof/>
+              </w:rPr>
               <w:instrText xml:space="preserve"> PAGEREF _Toc233174898 \h </w:instrText>
+            </w:r>
+            <w:r>
+              <w:rPr>
+                <w:noProof/>
+              </w:rPr>
+            </w:r>
+            <w:r>
+              <w:rPr>
+                <w:noProof/>
+              </w:rPr>
               <w:fldChar w:fldCharType="separate"/>
+            </w:r>
+            <w:r>
+              <w:rPr>
+                <w:noProof/>
+              </w:rPr>
               <w:t>14</w:t>
+            </w:r>
+            <w:r>
+              <w:rPr>
+                <w:noProof/>
+              </w:rPr>
               <w:fldChar w:fldCharType="end"/>
             </w:r>
           </w:hyperlink>
@@ -750,10 +1324,40 @@
                 <w:noProof/>
               </w:rPr>
               <w:tab/>
+            </w:r>
+            <w:r>
+              <w:rPr>
+                <w:noProof/>
+              </w:rPr>
               <w:fldChar w:fldCharType="begin"/>
+            </w:r>
+            <w:r>
+              <w:rPr>
+                <w:noProof/>
+              </w:rPr>
               <w:instrText xml:space="preserve"> PAGEREF _Toc233174899 \h </w:instrText>
+            </w:r>
+            <w:r>
+              <w:rPr>
+                <w:noProof/>
+              </w:rPr>
+            </w:r>
+            <w:r>
+              <w:rPr>
+                <w:noProof/>
+              </w:rPr>
               <w:fldChar w:fldCharType="separate"/>
+            </w:r>
+            <w:r>
+              <w:rPr>
+                <w:noProof/>
+              </w:rPr>
               <w:t>15</w:t>
+            </w:r>
+            <w:r>
+              <w:rPr>
+                <w:noProof/>
+              </w:rPr>
               <w:fldChar w:fldCharType="end"/>
             </w:r>
           </w:hyperlink>
@@ -781,10 +1385,40 @@
                 <w:noProof/>
               </w:rPr>
               <w:tab/>
+            </w:r>
+            <w:r>
+              <w:rPr>
+                <w:noProof/>
+              </w:rPr>
               <w:fldChar w:fldCharType="begin"/>
+            </w:r>
+            <w:r>
+              <w:rPr>
+                <w:noProof/>
+              </w:rPr>
               <w:instrText xml:space="preserve"> PAGEREF _Toc233174900 \h </w:instrText>
+            </w:r>
+            <w:r>
+              <w:rPr>
+                <w:noProof/>
+              </w:rPr>
+            </w:r>
+            <w:r>
+              <w:rPr>
+                <w:noProof/>
+              </w:rPr>
               <w:fldChar w:fldCharType="separate"/>
+            </w:r>
+            <w:r>
+              <w:rPr>
+                <w:noProof/>
+              </w:rPr>
               <w:t>15</w:t>
+            </w:r>
+            <w:r>
+              <w:rPr>
+                <w:noProof/>
+              </w:rPr>
               <w:fldChar w:fldCharType="end"/>
             </w:r>
           </w:hyperlink>
@@ -812,10 +1446,40 @@
                 <w:noProof/>
               </w:rPr>
               <w:tab/>
+            </w:r>
+            <w:r>
+              <w:rPr>
+                <w:noProof/>
+              </w:rPr>
               <w:fldChar w:fldCharType="begin"/>
+            </w:r>
+            <w:r>
+              <w:rPr>
+                <w:noProof/>
+              </w:rPr>
               <w:instrText xml:space="preserve"> PAGEREF _Toc233174901 \h </w:instrText>
+            </w:r>
+            <w:r>
+              <w:rPr>
+                <w:noProof/>
+              </w:rPr>
+            </w:r>
+            <w:r>
+              <w:rPr>
+                <w:noProof/>
+              </w:rPr>
               <w:fldChar w:fldCharType="separate"/>
+            </w:r>
+            <w:r>
+              <w:rPr>
+                <w:noProof/>
+              </w:rPr>
               <w:t>17</w:t>
+            </w:r>
+            <w:r>
+              <w:rPr>
+                <w:noProof/>
+              </w:rPr>
               <w:fldChar w:fldCharType="end"/>
             </w:r>
           </w:hyperlink>
@@ -843,10 +1507,40 @@
                 <w:noProof/>
               </w:rPr>
               <w:tab/>
+            </w:r>
+            <w:r>
+              <w:rPr>
+                <w:noProof/>
+              </w:rPr>
               <w:fldChar w:fldCharType="begin"/>
+            </w:r>
+            <w:r>
+              <w:rPr>
+                <w:noProof/>
+              </w:rPr>
               <w:instrText xml:space="preserve"> PAGEREF _Toc233174902 \h </w:instrText>
+            </w:r>
+            <w:r>
+              <w:rPr>
+                <w:noProof/>
+              </w:rPr>
+            </w:r>
+            <w:r>
+              <w:rPr>
+                <w:noProof/>
+              </w:rPr>
               <w:fldChar w:fldCharType="separate"/>
+            </w:r>
+            <w:r>
+              <w:rPr>
+                <w:noProof/>
+              </w:rPr>
               <w:t>17</w:t>
+            </w:r>
+            <w:r>
+              <w:rPr>
+                <w:noProof/>
+              </w:rPr>
               <w:fldChar w:fldCharType="end"/>
             </w:r>
           </w:hyperlink>
@@ -874,10 +1568,40 @@
                 <w:noProof/>
               </w:rPr>
               <w:tab/>
+            </w:r>
+            <w:r>
+              <w:rPr>
+                <w:noProof/>
+              </w:rPr>
               <w:fldChar w:fldCharType="begin"/>
+            </w:r>
+            <w:r>
+              <w:rPr>
+                <w:noProof/>
+              </w:rPr>
               <w:instrText xml:space="preserve"> PAGEREF _Toc233174903 \h </w:instrText>
+            </w:r>
+            <w:r>
+              <w:rPr>
+                <w:noProof/>
+              </w:rPr>
+            </w:r>
+            <w:r>
+              <w:rPr>
+                <w:noProof/>
+              </w:rPr>
               <w:fldChar w:fldCharType="separate"/>
+            </w:r>
+            <w:r>
+              <w:rPr>
+                <w:noProof/>
+              </w:rPr>
               <w:t>17</w:t>
+            </w:r>
+            <w:r>
+              <w:rPr>
+                <w:noProof/>
+              </w:rPr>
               <w:fldChar w:fldCharType="end"/>
             </w:r>
           </w:hyperlink>
@@ -905,10 +1629,40 @@
                 <w:noProof/>
               </w:rPr>
               <w:tab/>
+            </w:r>
+            <w:r>
+              <w:rPr>
+                <w:noProof/>
+              </w:rPr>
               <w:fldChar w:fldCharType="begin"/>
+            </w:r>
+            <w:r>
+              <w:rPr>
+                <w:noProof/>
+              </w:rPr>
               <w:instrText xml:space="preserve"> PAGEREF _Toc233174904 \h </w:instrText>
+            </w:r>
+            <w:r>
+              <w:rPr>
+                <w:noProof/>
+              </w:rPr>
+            </w:r>
+            <w:r>
+              <w:rPr>
+                <w:noProof/>
+              </w:rPr>
               <w:fldChar w:fldCharType="separate"/>
+            </w:r>
+            <w:r>
+              <w:rPr>
+                <w:noProof/>
+              </w:rPr>
               <w:t>21</w:t>
+            </w:r>
+            <w:r>
+              <w:rPr>
+                <w:noProof/>
+              </w:rPr>
               <w:fldChar w:fldCharType="end"/>
             </w:r>
           </w:hyperlink>
@@ -936,10 +1690,40 @@
                 <w:noProof/>
               </w:rPr>
               <w:tab/>
+            </w:r>
+            <w:r>
+              <w:rPr>
+                <w:noProof/>
+              </w:rPr>
               <w:fldChar w:fldCharType="begin"/>
+            </w:r>
+            <w:r>
+              <w:rPr>
+                <w:noProof/>
+              </w:rPr>
               <w:instrText xml:space="preserve"> PAGEREF _Toc233174905 \h </w:instrText>
+            </w:r>
+            <w:r>
+              <w:rPr>
+                <w:noProof/>
+              </w:rPr>
+            </w:r>
+            <w:r>
+              <w:rPr>
+                <w:noProof/>
+              </w:rPr>
               <w:fldChar w:fldCharType="separate"/>
+            </w:r>
+            <w:r>
+              <w:rPr>
+                <w:noProof/>
+              </w:rPr>
               <w:t>24</w:t>
+            </w:r>
+            <w:r>
+              <w:rPr>
+                <w:noProof/>
+              </w:rPr>
               <w:fldChar w:fldCharType="end"/>
             </w:r>
           </w:hyperlink>
@@ -967,10 +1751,40 @@
                 <w:noProof/>
               </w:rPr>
               <w:tab/>
+            </w:r>
+            <w:r>
+              <w:rPr>
+                <w:noProof/>
+              </w:rPr>
               <w:fldChar w:fldCharType="begin"/>
+            </w:r>
+            <w:r>
+              <w:rPr>
+                <w:noProof/>
+              </w:rPr>
               <w:instrText xml:space="preserve"> PAGEREF _Toc233174906 \h </w:instrText>
+            </w:r>
+            <w:r>
+              <w:rPr>
+                <w:noProof/>
+              </w:rPr>
+            </w:r>
+            <w:r>
+              <w:rPr>
+                <w:noProof/>
+              </w:rPr>
               <w:fldChar w:fldCharType="separate"/>
+            </w:r>
+            <w:r>
+              <w:rPr>
+                <w:noProof/>
+              </w:rPr>
               <w:t>26</w:t>
+            </w:r>
+            <w:r>
+              <w:rPr>
+                <w:noProof/>
+              </w:rPr>
               <w:fldChar w:fldCharType="end"/>
             </w:r>
           </w:hyperlink>
@@ -998,10 +1812,40 @@
                 <w:noProof/>
               </w:rPr>
               <w:tab/>
+            </w:r>
+            <w:r>
+              <w:rPr>
+                <w:noProof/>
+              </w:rPr>
               <w:fldChar w:fldCharType="begin"/>
+            </w:r>
+            <w:r>
+              <w:rPr>
+                <w:noProof/>
+              </w:rPr>
               <w:instrText xml:space="preserve"> PAGEREF _Toc233174907 \h </w:instrText>
+            </w:r>
+            <w:r>
+              <w:rPr>
+                <w:noProof/>
+              </w:rPr>
+            </w:r>
+            <w:r>
+              <w:rPr>
+                <w:noProof/>
+              </w:rPr>
               <w:fldChar w:fldCharType="separate"/>
+            </w:r>
+            <w:r>
+              <w:rPr>
+                <w:noProof/>
+              </w:rPr>
               <w:t>27</w:t>
+            </w:r>
+            <w:r>
+              <w:rPr>
+                <w:noProof/>
+              </w:rPr>
               <w:fldChar w:fldCharType="end"/>
             </w:r>
           </w:hyperlink>
@@ -1029,10 +1873,40 @@
                 <w:noProof/>
               </w:rPr>
               <w:tab/>
+            </w:r>
+            <w:r>
+              <w:rPr>
+                <w:noProof/>
+              </w:rPr>
               <w:fldChar w:fldCharType="begin"/>
+            </w:r>
+            <w:r>
+              <w:rPr>
+                <w:noProof/>
+              </w:rPr>
               <w:instrText xml:space="preserve"> PAGEREF _Toc233174908 \h </w:instrText>
+            </w:r>
+            <w:r>
+              <w:rPr>
+                <w:noProof/>
+              </w:rPr>
+            </w:r>
+            <w:r>
+              <w:rPr>
+                <w:noProof/>
+              </w:rPr>
               <w:fldChar w:fldCharType="separate"/>
+            </w:r>
+            <w:r>
+              <w:rPr>
+                <w:noProof/>
+              </w:rPr>
               <w:t>28</w:t>
+            </w:r>
+            <w:r>
+              <w:rPr>
+                <w:noProof/>
+              </w:rPr>
               <w:fldChar w:fldCharType="end"/>
             </w:r>
           </w:hyperlink>
@@ -1060,10 +1934,40 @@
                 <w:noProof/>
               </w:rPr>
               <w:tab/>
+            </w:r>
+            <w:r>
+              <w:rPr>
+                <w:noProof/>
+              </w:rPr>
               <w:fldChar w:fldCharType="begin"/>
+            </w:r>
+            <w:r>
+              <w:rPr>
+                <w:noProof/>
+              </w:rPr>
               <w:instrText xml:space="preserve"> PAGEREF _Toc233174909 \h </w:instrText>
+            </w:r>
+            <w:r>
+              <w:rPr>
+                <w:noProof/>
+              </w:rPr>
+            </w:r>
+            <w:r>
+              <w:rPr>
+                <w:noProof/>
+              </w:rPr>
               <w:fldChar w:fldCharType="separate"/>
+            </w:r>
+            <w:r>
+              <w:rPr>
+                <w:noProof/>
+              </w:rPr>
               <w:t>30</w:t>
+            </w:r>
+            <w:r>
+              <w:rPr>
+                <w:noProof/>
+              </w:rPr>
               <w:fldChar w:fldCharType="end"/>
             </w:r>
           </w:hyperlink>
@@ -1091,10 +1995,40 @@
                 <w:noProof/>
               </w:rPr>
               <w:tab/>
+            </w:r>
+            <w:r>
+              <w:rPr>
+                <w:noProof/>
+              </w:rPr>
               <w:fldChar w:fldCharType="begin"/>
+            </w:r>
+            <w:r>
+              <w:rPr>
+                <w:noProof/>
+              </w:rPr>
               <w:instrText xml:space="preserve"> PAGEREF _Toc233174910 \h </w:instrText>
+            </w:r>
+            <w:r>
+              <w:rPr>
+                <w:noProof/>
+              </w:rPr>
+            </w:r>
+            <w:r>
+              <w:rPr>
+                <w:noProof/>
+              </w:rPr>
               <w:fldChar w:fldCharType="separate"/>
+            </w:r>
+            <w:r>
+              <w:rPr>
+                <w:noProof/>
+              </w:rPr>
               <w:t>32</w:t>
+            </w:r>
+            <w:r>
+              <w:rPr>
+                <w:noProof/>
+              </w:rPr>
               <w:fldChar w:fldCharType="end"/>
             </w:r>
           </w:hyperlink>
@@ -1122,10 +2056,40 @@
                 <w:noProof/>
               </w:rPr>
               <w:tab/>
+            </w:r>
+            <w:r>
+              <w:rPr>
+                <w:noProof/>
+              </w:rPr>
               <w:fldChar w:fldCharType="begin"/>
+            </w:r>
+            <w:r>
+              <w:rPr>
+                <w:noProof/>
+              </w:rPr>
               <w:instrText xml:space="preserve"> PAGEREF _Toc233174911 \h </w:instrText>
+            </w:r>
+            <w:r>
+              <w:rPr>
+                <w:noProof/>
+              </w:rPr>
+            </w:r>
+            <w:r>
+              <w:rPr>
+                <w:noProof/>
+              </w:rPr>
               <w:fldChar w:fldCharType="separate"/>
+            </w:r>
+            <w:r>
+              <w:rPr>
+                <w:noProof/>
+              </w:rPr>
               <w:t>33</w:t>
+            </w:r>
+            <w:r>
+              <w:rPr>
+                <w:noProof/>
+              </w:rPr>
               <w:fldChar w:fldCharType="end"/>
             </w:r>
           </w:hyperlink>
@@ -1153,10 +2117,40 @@
                 <w:noProof/>
               </w:rPr>
               <w:tab/>
+            </w:r>
+            <w:r>
+              <w:rPr>
+                <w:noProof/>
+              </w:rPr>
               <w:fldChar w:fldCharType="begin"/>
+            </w:r>
+            <w:r>
+              <w:rPr>
+                <w:noProof/>
+              </w:rPr>
               <w:instrText xml:space="preserve"> PAGEREF _Toc233174912 \h </w:instrText>
+            </w:r>
+            <w:r>
+              <w:rPr>
+                <w:noProof/>
+              </w:rPr>
+            </w:r>
+            <w:r>
+              <w:rPr>
+                <w:noProof/>
+              </w:rPr>
               <w:fldChar w:fldCharType="separate"/>
+            </w:r>
+            <w:r>
+              <w:rPr>
+                <w:noProof/>
+              </w:rPr>
               <w:t>34</w:t>
+            </w:r>
+            <w:r>
+              <w:rPr>
+                <w:noProof/>
+              </w:rPr>
               <w:fldChar w:fldCharType="end"/>
             </w:r>
           </w:hyperlink>
@@ -1184,10 +2178,40 @@
                 <w:noProof/>
               </w:rPr>
               <w:tab/>
+            </w:r>
+            <w:r>
+              <w:rPr>
+                <w:noProof/>
+              </w:rPr>
               <w:fldChar w:fldCharType="begin"/>
+            </w:r>
+            <w:r>
+              <w:rPr>
+                <w:noProof/>
+              </w:rPr>
               <w:instrText xml:space="preserve"> PAGEREF _Toc233174913 \h </w:instrText>
+            </w:r>
+            <w:r>
+              <w:rPr>
+                <w:noProof/>
+              </w:rPr>
+            </w:r>
+            <w:r>
+              <w:rPr>
+                <w:noProof/>
+              </w:rPr>
               <w:fldChar w:fldCharType="separate"/>
+            </w:r>
+            <w:r>
+              <w:rPr>
+                <w:noProof/>
+              </w:rPr>
               <w:t>34</w:t>
+            </w:r>
+            <w:r>
+              <w:rPr>
+                <w:noProof/>
+              </w:rPr>
               <w:fldChar w:fldCharType="end"/>
             </w:r>
           </w:hyperlink>
@@ -1215,10 +2239,40 @@
                 <w:noProof/>
               </w:rPr>
               <w:tab/>
+            </w:r>
+            <w:r>
+              <w:rPr>
+                <w:noProof/>
+              </w:rPr>
               <w:fldChar w:fldCharType="begin"/>
+            </w:r>
+            <w:r>
+              <w:rPr>
+                <w:noProof/>
+              </w:rPr>
               <w:instrText xml:space="preserve"> PAGEREF _Toc233174914 \h </w:instrText>
+            </w:r>
+            <w:r>
+              <w:rPr>
+                <w:noProof/>
+              </w:rPr>
+            </w:r>
+            <w:r>
+              <w:rPr>
+                <w:noProof/>
+              </w:rPr>
               <w:fldChar w:fldCharType="separate"/>
+            </w:r>
+            <w:r>
+              <w:rPr>
+                <w:noProof/>
+              </w:rPr>
               <w:t>34</w:t>
+            </w:r>
+            <w:r>
+              <w:rPr>
+                <w:noProof/>
+              </w:rPr>
               <w:fldChar w:fldCharType="end"/>
             </w:r>
           </w:hyperlink>
@@ -1246,10 +2300,40 @@
                 <w:noProof/>
               </w:rPr>
               <w:tab/>
+            </w:r>
+            <w:r>
+              <w:rPr>
+                <w:noProof/>
+              </w:rPr>
               <w:fldChar w:fldCharType="begin"/>
+            </w:r>
+            <w:r>
+              <w:rPr>
+                <w:noProof/>
+              </w:rPr>
               <w:instrText xml:space="preserve"> PAGEREF _Toc233174915 \h </w:instrText>
+            </w:r>
+            <w:r>
+              <w:rPr>
+                <w:noProof/>
+              </w:rPr>
+            </w:r>
+            <w:r>
+              <w:rPr>
+                <w:noProof/>
+              </w:rPr>
               <w:fldChar w:fldCharType="separate"/>
+            </w:r>
+            <w:r>
+              <w:rPr>
+                <w:noProof/>
+              </w:rPr>
               <w:t>35</w:t>
+            </w:r>
+            <w:r>
+              <w:rPr>
+                <w:noProof/>
+              </w:rPr>
               <w:fldChar w:fldCharType="end"/>
             </w:r>
           </w:hyperlink>
@@ -1277,10 +2361,40 @@
                 <w:noProof/>
               </w:rPr>
               <w:tab/>
+            </w:r>
+            <w:r>
+              <w:rPr>
+                <w:noProof/>
+              </w:rPr>
               <w:fldChar w:fldCharType="begin"/>
+            </w:r>
+            <w:r>
+              <w:rPr>
+                <w:noProof/>
+              </w:rPr>
               <w:instrText xml:space="preserve"> PAGEREF _Toc233174916 \h </w:instrText>
+            </w:r>
+            <w:r>
+              <w:rPr>
+                <w:noProof/>
+              </w:rPr>
+            </w:r>
+            <w:r>
+              <w:rPr>
+                <w:noProof/>
+              </w:rPr>
               <w:fldChar w:fldCharType="separate"/>
+            </w:r>
+            <w:r>
+              <w:rPr>
+                <w:noProof/>
+              </w:rPr>
               <w:t>36</w:t>
+            </w:r>
+            <w:r>
+              <w:rPr>
+                <w:noProof/>
+              </w:rPr>
               <w:fldChar w:fldCharType="end"/>
             </w:r>
           </w:hyperlink>
@@ -1308,10 +2422,40 @@
                 <w:noProof/>
               </w:rPr>
               <w:tab/>
+            </w:r>
+            <w:r>
+              <w:rPr>
+                <w:noProof/>
+              </w:rPr>
               <w:fldChar w:fldCharType="begin"/>
+            </w:r>
+            <w:r>
+              <w:rPr>
+                <w:noProof/>
+              </w:rPr>
               <w:instrText xml:space="preserve"> PAGEREF _Toc233174917 \h </w:instrText>
+            </w:r>
+            <w:r>
+              <w:rPr>
+                <w:noProof/>
+              </w:rPr>
+            </w:r>
+            <w:r>
+              <w:rPr>
+                <w:noProof/>
+              </w:rPr>
               <w:fldChar w:fldCharType="separate"/>
+            </w:r>
+            <w:r>
+              <w:rPr>
+                <w:noProof/>
+              </w:rPr>
               <w:t>36</w:t>
+            </w:r>
+            <w:r>
+              <w:rPr>
+                <w:noProof/>
+              </w:rPr>
               <w:fldChar w:fldCharType="end"/>
             </w:r>
           </w:hyperlink>
@@ -1339,10 +2483,40 @@
                 <w:noProof/>
               </w:rPr>
               <w:tab/>
+            </w:r>
+            <w:r>
+              <w:rPr>
+                <w:noProof/>
+              </w:rPr>
               <w:fldChar w:fldCharType="begin"/>
+            </w:r>
+            <w:r>
+              <w:rPr>
+                <w:noProof/>
+              </w:rPr>
               <w:instrText xml:space="preserve"> PAGEREF _Toc233174918 \h </w:instrText>
+            </w:r>
+            <w:r>
+              <w:rPr>
+                <w:noProof/>
+              </w:rPr>
+            </w:r>
+            <w:r>
+              <w:rPr>
+                <w:noProof/>
+              </w:rPr>
               <w:fldChar w:fldCharType="separate"/>
+            </w:r>
+            <w:r>
+              <w:rPr>
+                <w:noProof/>
+              </w:rPr>
               <w:t>36</w:t>
+            </w:r>
+            <w:r>
+              <w:rPr>
+                <w:noProof/>
+              </w:rPr>
               <w:fldChar w:fldCharType="end"/>
             </w:r>
           </w:hyperlink>
@@ -1371,7 +2545,10 @@
         <w:jc w:val="both"/>
       </w:pPr>
       <w:r>
-        <w:t>This report documents the design, implementation, and evaluation of a real-time breast ultrasound classification pipeline developed for the MathWorks MATLAB-Simulink Challenge (Project 259), undertaken in collaboration with Analog Devices, Inc. The project addresses the gap between offline diagnostic accuracy and the real-time speed required for practical deployment in portable ultrasound systems. Raw radio frequency signal data and clinical ultrasound images are carried through a five-stage pipeline consisting of image reconstruction, enhancement, and convolutional neural network classification, with lesions categorised as benign, malignant, or normal. Every algorithm in the pipeline, including beamforming, enhancement, and the classifier itself, was first designed and validated in MATLAB R2024b before being ported to Python for deployment on the NVIDIA Holoscan SDK, version 4.2.0, running on an NVIDIA RTX 4070 Laptop GPU under Windows Subsystem for Linux. The classification model, a MobileNetV2 architecture trained progressively across five combined breast ultrasound datasets and referred to throughout this report as the mega model, achieves an overall test accuracy of approximately 87 percent across 665 held-out test images, with the clinically critical malignant recall and overall throughput discussed in detail in the Results section. The deployed pipeline sustains a mean throughput of approximately 34 frames per second end to end. An optional, illustrative Simulink block diagram of the same five-stage architecture was also produced for documentation purposes, in line with the understanding that Simulink work, while encouraged by the challenge framing, was not a requirement for submission.</w:t>
+        <w:t>This report documents the design, implementation, and evaluation of a real-time breast ultrasound classification pipeline developed for the MathWorks MATLAB-Simulink Challenge (Project 259), undertaken in collaboration with Analog Devices, Inc. The project addresses the gap between offline diagnostic accuracy and the real-time speed required for practical deployment in portable ultrasound systems. Raw radio frequency signal data and clinical ultrasound images are carried through a five-stage pipeline consisting of image reconstruction, enhancement, and convolutional neural network classification, with lesions categorised as benign, malignant, or normal. Every algorithm in the pipeline, including beamforming, enhancement, and the classifier itself, was first designed and validated in MATLAB R2024b before being ported to Python for deployment on the NVIDIA Holoscan SDK, version 4.2.0, running on an NVIDIA RTX 4070 Laptop GPU under Windows Subsystem for Linux. The classification model, a MobileNetV2 architecture trained progressively across five combined breast ultrasound datasets and referred to throughout this report as the mega model, achieves an overall test accuracy of approximately 87 percent across 665 held-out test images, with the clinically critical malignant recall and overall throughput discussed in detail in the Results section. The deployed pipeline sustains a mean throughput of approximately 34 frames per second end to end. An optional, illustrative Simulink block diagram of the same five-stage architecture was also produced for documentation purposes</w:t>
+      </w:r>
+      <w:r>
+        <w:t>.</w:t>
       </w:r>
     </w:p>
     <w:p>
@@ -1440,6 +2617,8 @@
       </w:pPr>
       <w:r>
         <w:t xml:space="preserve">The project set out to build a complete, working pipeline that takes raw ultrasound data through to a real-time lesion classification, and to do so using an explicit, staged development workflow in which every component is first designed and verified in MATLAB before being deployed as a real-time application on NVIDIA Holoscan. The scope covers four major technical components: a beamforming or image reconstruction stage suited to the specific structure of the raw data actually available; an image enhancement stage selected through a comparative evaluation of standard ultrasound speckle reduction techniques; a convolutional neural network classifier trained and progressively improved </w:t>
+      </w:r>
+      <w:r>
         <w:lastRenderedPageBreak/>
         <w:t>across multiple public breast ultrasound datasets; and a Holoscan-based deployment of the full pipeline with measured, end-to-end real-time performance. An optional Simulink representation of the same architecture was treated as a supplementary, non-mandatory extension to the core deliverable. The scope explicitly excludes hardware integration with physical Analog Devices analog-to-digital converters, relying instead on the pre-recorded and publicly available datasets specified in the challenge's background material, and excludes building new dataset labelling tools, instead reusing existing dataset annotations throughout.</w:t>
       </w:r>
@@ -1500,6 +2679,8 @@
       </w:pPr>
       <w:r>
         <w:t xml:space="preserve">Convolutional neural networks have become the standard approach for image-based medical lesion classification because they learn discriminative spatial features directly from labelled images rather than requiring hand-engineered descriptors. Training such a network from randomly initialised weights typically requires far more labelled data than is </w:t>
+      </w:r>
+      <w:r>
         <w:lastRenderedPageBreak/>
         <w:t>available in any single public breast ultrasound dataset, which motivates the use of transfer learning, where a network already trained on a large general-purpose image dataset is fine-tuned on the smaller, domain-specific dataset of interest. This project uses MobileNetV2, a convolutional architecture designed to be lightweight enough for real-time inference on resource-constrained or edge hardware while retaining competitive classification accuracy, fine-tuned through MATLAB's Deep Learning Toolbox on combined breast ultrasound image datasets. The lightweight design of MobileNetV2 was a deliberate choice consistent with the project's overall emphasis on real-time deployability rather than offline accuracy alone.</w:t>
       </w:r>
@@ -1589,6 +2770,8 @@
       </w:pPr>
       <w:r>
         <w:t xml:space="preserve">Every algorithm used in the final deployed pipeline was first built and validated as ordinary MATLAB code before any Python implementation was written. This was a deliberate staged progression rather than parallel development in two languages. The beamforming approach was worked out, tested, and corrected entirely within MATLAB scripts before </w:t>
+      </w:r>
+      <w:r>
         <w:lastRenderedPageBreak/>
         <w:t>its Python equivalent was written for the Holoscan beamforming operator. The image enhancement filter was selected through a MATLAB-based comparison of candidate filters before being reimplemented in Python. The CNN classifier was trained, evaluated, and exported to the ONNX format entirely within MATLAB's Deep Learning Toolbox, with the Python side of the pipeline responsible only for loading that exported model and running inference on it, not for any training or retraining. This staged approach meant that algorithmic correctness, for instance the per-column envelope detection approach for OASBUD, or the exact preprocessing expected by the exported ONNX model, was established once in MATLAB and then carried over deliberately into the Python implementation, rather than being independently rediscovered or risking divergence between two parallel implementations.</w:t>
       </w:r>
@@ -1649,6 +2832,8 @@
       </w:pPr>
       <w:r>
         <w:t xml:space="preserve">The initial approach to OASBUD followed the assumption, reasonable for most raw ultrasound datasets, that its radio frequency data represented raw, per-element transducer channel data suitable for conventional delay and sum beamforming. Several beamforming variants were implemented and evaluated against OASBUD on this assumption, including standard delay and sum, delay and sum with a coherence factor weighting, delay-multiply-and-sum, frequency-domain or f-k migration, and minimum variance beamforming. None of these produced clinically interpretable images. Investigation into why revealed the underlying issue: OASBUD's stored radio frequency matrix does not represent raw element data at all. Each column is already a complete, pre-formed scan line, meaning whatever original acquisition system produced this dataset had already performed its own beamforming before saving the data. There is, in other </w:t>
+      </w:r>
+      <w:r>
         <w:lastRenderedPageBreak/>
         <w:t>words, no raw element geometry left for any delay and sum style algorithm to operate on, which is why every geometric beamforming approach tested against this assumption failed to produce a usable image, independent of how carefully each was implemented.</w:t>
       </w:r>
@@ -1703,6 +2888,7 @@
               <w:rPr>
                 <w:i/>
                 <w:iCs/>
+                <w:noProof/>
                 <w:color w:val="666666"/>
                 <w:sz w:val="22"/>
                 <w:szCs w:val="22"/>
@@ -2075,6 +3261,8 @@
       </w:pPr>
       <w:r>
         <w:t xml:space="preserve">This accuracy ceiling, and specifically the benign precision weakness, was judged unsatisfactory for a model intended to generalise beyond a single dataset's particular imaging characteristics and patient population. The response was to progressively expand the training corpus rather than to tune the BUSI-only model further. BUS-UCLM was added first, broadening the dataset's clinical scanner diversity, with the combined model's confusion matrix recorded in the project's figures, though a separately tabulated </w:t>
+      </w:r>
+      <w:r>
         <w:lastRenderedPageBreak/>
         <w:t>numeric breakdown for this intermediate two-dataset stage was not retained alongside the BUSI-only and final mega model numbers reported in Section 6.1. BUS-BRA and BrEaST were added next, substantially increasing the overall size and diversity of the training corpus, and finally OASBUD-PNG was added so that the classifier would see at least some images derived from the project's own raw radio frequency reconstruction pipeline during training, rather than exclusively clinical scanner output. The resulting five-dataset mega model, architecturally still a MobileNetV2 trained through transfer learning, was exported as trainedMobileNetV2_mega.onnx and is the model used throughout the deployed Holoscan pipeline and reported on in Section 6.1.2.</w:t>
       </w:r>
@@ -2162,7 +3350,7 @@
         <w:jc w:val="both"/>
       </w:pPr>
       <w:r>
-        <w:t xml:space="preserve">This section reports what the project actually achieved, measured rather than estimated, across four areas. Section 6.1 covers classification performance, the confusion matrices for each training stage and the final mega model's precision, recall, and F1 scores. Section 6.2 covers real-time throughput, the per-stage latency breakdown and the resulting frames-per-second figure achieved on the deployed Holoscan pipeline. Section 6.3 reports a supplementary plane-wave compounding study conducted on a separate phantom dataset to test a beamforming hypothesis. Section 6.4 clarifies the role of the Simulink diagram relative to these results.</w:t>
+        <w:t>This section reports what the project actually achieved, measured rather than estimated, across four areas. Section 6.1 covers classification performance, the confusion matrices for each training stage and the final mega model's precision, recall, and F1 scores. Section 6.2 covers real-time throughput, the per-stage latency breakdown and the resulting frames-per-second figure achieved on the deployed Holoscan pipeline. Section 6.3 reports a supplementary plane-wave compounding study conducted on a separate phantom dataset to test a beamforming hypothesis. Section 6.4 clarifies the role of the Simulink diagram relative to these results.</w:t>
       </w:r>
     </w:p>
     <w:p>
@@ -2253,6 +3441,7 @@
                 <w:sz w:val="22"/>
                 <w:szCs w:val="22"/>
               </w:rPr>
+              <w:lastRenderedPageBreak/>
               <w:drawing>
                 <wp:inline distT="0" distB="0" distL="0" distR="0" wp14:anchorId="28B66016" wp14:editId="1DD6A7BA">
                   <wp:extent cx="5943600" cy="4457700"/>
@@ -2599,6 +3788,7 @@
       </w:pPr>
       <w:bookmarkStart w:id="24" w:name="_Toc233174904"/>
       <w:r>
+        <w:lastRenderedPageBreak/>
         <w:t>6.1.2 Final Mega Model Metrics</w:t>
       </w:r>
       <w:bookmarkEnd w:id="24"/>
@@ -3170,9 +4360,9 @@
         <w:rPr>
           <w:b/>
           <w:bCs/>
+          <w:color w:val="1F4E79"/>
           <w:sz w:val="28"/>
           <w:szCs w:val="28"/>
-          <w:color w:val="1F4E79"/>
         </w:rPr>
         <w:t>Overall Test Accuracy: 87.37%</w:t>
       </w:r>
@@ -3459,6 +4649,7 @@
       </w:pPr>
       <w:bookmarkStart w:id="25" w:name="_Toc233174905"/>
       <w:r>
+        <w:lastRenderedPageBreak/>
         <w:t>6.2 Real-Time Throughput</w:t>
       </w:r>
       <w:bookmarkEnd w:id="25"/>
@@ -3726,7 +4917,6 @@
                 <w:sz w:val="21"/>
                 <w:szCs w:val="21"/>
               </w:rPr>
-              <w:lastRenderedPageBreak/>
               <w:t>Enhancement</w:t>
             </w:r>
           </w:p>
@@ -4241,6 +5431,8 @@
       </w:pPr>
       <w:r>
         <w:t xml:space="preserve">Three reconstructions of the same underlying hypoechoic phantom target were produced and compared: a single-angle delay and sum reconstruction using only the boresight transmission angle, a 75-angle coherent compound reconstruction formed by summing delayed radio frequency data across all angles before envelope detection, and a 75-angle incoherent average formed by detecting each angle's image separately and averaging the resulting intensities. A background speckle signal-to-noise ratio, measured as the ratio of mean to standard deviation within a region of the image free of any near-field artefact or target structure, was used as a quantitative point of comparison. The single-angle reconstruction measured a background signal-to-noise ratio of 1.49. The coherent compound reconstruction measured 1.36, marginally lower than the single-angle case, consistent with coherent compounding's known primary benefit being resolution and signal gain through synthetic transmit focusing rather than speckle reduction specifically. The incoherent average measured 2.62, a 1.76-fold improvement over the single-angle case, though well below the 8.66-fold improvement that a textbook assumption of fully independent speckle realisations across all 75 angles would predict, attributable to the </w:t>
+      </w:r>
+      <w:r>
         <w:lastRenderedPageBreak/>
         <w:t>limited 32-degree total angular span across which the 75 angles are spread, which leaves neighbouring angles substantially correlated rather than statistically independent.</w:t>
       </w:r>
@@ -4441,6 +5633,8 @@
       </w:pPr>
       <w:r>
         <w:t xml:space="preserve">Integration of the exported ONNX classification model into the Python-based Holoscan inference operator surfaced two related but distinct bugs. The first was a double softmax error: because MATLAB's exportONNXNetwork function bakes the network's final softmax layer directly into the exported ONNX graph under the output node name new_softmax, an initial Python implementation that additionally applied its own softmax function to that output produced flattened, uninformative confidence scores clustered near 50 percent regardless of the true prediction, since softmax was effectively being applied twice. The second was a double normalisation error of the same character: the same export function also bakes the image input layer's normalisation directly into the graph, so an initial implementation that additionally normalised pixel values in Python before passing them to the model degraded results further. Both were diagnosed by tracing the exported ONNX graph's actual input and output node behaviour rather than assuming standard preprocessing conventions, and both were fixed by removing the corresponding </w:t>
+      </w:r>
+      <w:r>
         <w:lastRenderedPageBreak/>
         <w:t>Python-side step entirely, passing raw, unnormalised pixel values into the model and reading its output directly as final class probabilities.</w:t>
       </w:r>
@@ -5777,6 +6971,7 @@
   <w:style w:type="character" w:default="1" w:styleId="DefaultParagraphFont">
     <w:name w:val="Default Paragraph Font"/>
     <w:uiPriority w:val="1"/>
+    <w:semiHidden/>
     <w:unhideWhenUsed/>
   </w:style>
   <w:style w:type="table" w:default="1" w:styleId="TableNormal">

</xml_diff>

<commit_message>
Fix hardcoded paths for portability, add bundled sample data, and submission compliance updates
- Replace hardcoded Windows/WSL2 paths in data_source_op.py, inference_op.py,
  output_op.py, and Phase6_Pipeline_Benchmark.py with repo-relative defaults
  and env var overrides (OASBUD_PATH, ONNX_MODEL_PATH, RESULTS_DIR)
- Add data/sample/OASBUD_sample.mat: 10-patient balanced sample (5 malignant,
  5 benign) for one-click testing without the full dataset
- Add Holoscan/requirements.txt
- Add .gitignore (build artifacts, Python cache, Word lock files, run outputs)
- Update README: one-click run instructions, Quick Test/Verification section,
  Generative AI Usage acknowledgment, Contact section
- Add matching Generative AI Usage and Acknowledgment section to
  Project_Documentation.docx
</commit_message>
<xml_diff>
--- a/Project_Documentation.docx
+++ b/Project_Documentation.docx
@@ -1,5 +1,36 @@
 
-<file path=word/document.xml><?xml version="1.0" encoding="utf-8"?>
+<file path=docProps\app.xml><?xml version="1.0" encoding="utf-8"?>
+<Properties xmlns="http://schemas.openxmlformats.org/officeDocument/2006/extended-properties" xmlns:vt="http://schemas.openxmlformats.org/officeDocument/2006/docPropsVTypes">
+  <Template>Normal</Template>
+  <TotalTime>2</TotalTime>
+  <Pages>36</Pages>
+  <Words>8037</Words>
+  <Characters>45816</Characters>
+  <Application>Microsoft Office Word</Application>
+  <DocSecurity>0</DocSecurity>
+  <Lines>381</Lines>
+  <Paragraphs>107</Paragraphs>
+  <ScaleCrop>false</ScaleCrop>
+  <Company/>
+  <LinksUpToDate>false</LinksUpToDate>
+  <CharactersWithSpaces>53746</CharactersWithSpaces>
+  <SharedDoc>false</SharedDoc>
+  <HyperlinksChanged>false</HyperlinksChanged>
+  <AppVersion>16.0000</AppVersion>
+</Properties>
+</file>
+
+<file path=docProps\core.xml><?xml version="1.0" encoding="utf-8"?>
+<cp:coreProperties xmlns:cp="http://schemas.openxmlformats.org/package/2006/metadata/core-properties" xmlns:dc="http://purl.org/dc/elements/1.1/" xmlns:dcterms="http://purl.org/dc/terms/" xmlns:dcmitype="http://purl.org/dc/dcmitype/" xmlns:xsi="http://www.w3.org/2001/XMLSchema-instance">
+  <dc:creator>Un-named</dc:creator>
+  <cp:lastModifiedBy>Rohith Ram</cp:lastModifiedBy>
+  <cp:revision>5</cp:revision>
+  <dcterms:created xsi:type="dcterms:W3CDTF">2026-06-24T10:48:00Z</dcterms:created>
+  <dcterms:modified xsi:type="dcterms:W3CDTF">2026-06-26T14:13:00Z</dcterms:modified>
+</cp:coreProperties>
+</file>
+
+<file path=word\document.xml><?xml version="1.0" encoding="utf-8"?>
 <w:document xmlns:wpc="http://schemas.microsoft.com/office/word/2010/wordprocessingCanvas" xmlns:cx="http://schemas.microsoft.com/office/drawing/2014/chartex" xmlns:cx1="http://schemas.microsoft.com/office/drawing/2015/9/8/chartex" xmlns:cx2="http://schemas.microsoft.com/office/drawing/2015/10/21/chartex" xmlns:cx3="http://schemas.microsoft.com/office/drawing/2016/5/9/chartex" xmlns:cx4="http://schemas.microsoft.com/office/drawing/2016/5/10/chartex" xmlns:cx5="http://schemas.microsoft.com/office/drawing/2016/5/11/chartex" xmlns:cx6="http://schemas.microsoft.com/office/drawing/2016/5/12/chartex" xmlns:cx7="http://schemas.microsoft.com/office/drawing/2016/5/13/chartex" xmlns:cx8="http://schemas.microsoft.com/office/drawing/2016/5/14/chartex" xmlns:mc="http://schemas.openxmlformats.org/markup-compatibility/2006" xmlns:aink="http://schemas.microsoft.com/office/drawing/2016/ink" xmlns:am3d="http://schemas.microsoft.com/office/drawing/2017/model3d" xmlns:o="urn:schemas-microsoft-com:office:office" xmlns:oel="http://schemas.microsoft.com/office/2019/extlst" xmlns:r="http://schemas.openxmlformats.org/officeDocument/2006/relationships" xmlns:m="http://schemas.openxmlformats.org/officeDocument/2006/math" xmlns:v="urn:schemas-microsoft-com:vml" xmlns:wp14="http://schemas.microsoft.com/office/word/2010/wordprocessingDrawing" xmlns:wp="http://schemas.openxmlformats.org/drawingml/2006/wordprocessingDrawing" xmlns:w10="urn:schemas-microsoft-com:office:word" xmlns:w="http://schemas.openxmlformats.org/wordprocessingml/2006/main" xmlns:w14="http://schemas.microsoft.com/office/word/2010/wordml" xmlns:w15="http://schemas.microsoft.com/office/word/2012/wordml" xmlns:w16cex="http://schemas.microsoft.com/office/word/2018/wordml/cex" xmlns:w16cid="http://schemas.microsoft.com/office/word/2016/wordml/cid" xmlns:w16="http://schemas.microsoft.com/office/word/2018/wordml" xmlns:w16du="http://schemas.microsoft.com/office/word/2023/wordml/word16du" xmlns:w16sdtdh="http://schemas.microsoft.com/office/word/2020/wordml/sdtdatahash" xmlns:w16sdtfl="http://schemas.microsoft.com/office/word/2024/wordml/sdtformatlock" xmlns:w16se="http://schemas.microsoft.com/office/word/2015/wordml/symex" xmlns:wpg="http://schemas.microsoft.com/office/word/2010/wordprocessingGroup" xmlns:wpi="http://schemas.microsoft.com/office/word/2010/wordprocessingInk" xmlns:wne="http://schemas.microsoft.com/office/word/2006/wordml" xmlns:wps="http://schemas.microsoft.com/office/word/2010/wordprocessingShape" mc:Ignorable="w14 w15 w16se w16cid w16 w16cex w16sdtdh w16sdtfl w16du wp14">
   <w:body>
     <w:p>
@@ -6261,6 +6292,34 @@
       </w:tr>
     </w:tbl>
     <w:p/>
+    <w:p>
+      <w:pPr>
+        <w:pStyle w:val="Heading1"/>
+      </w:pPr>
+      <w:bookmarkStart w:id="39" w:name="_Toc233174919"/>
+      <w:r>
+        <w:t>14. Generative AI Usage and Acknowledgment</w:t>
+      </w:r>
+      <w:bookmarkEnd w:id="39"/>
+    </w:p>
+    <w:p>
+      <w:pPr>
+        <w:spacing w:after="200" w:line="276" w:lineRule="auto"/>
+        <w:jc w:val="both"/>
+      </w:pPr>
+      <w:r>
+        <w:t>Generative AI (Claude, Anthropic) was used during this project to assist with debugging (ONNX inference normalisation and softmax issues, GPU Coder environment configuration), Holoscan pipeline integration, and drafting of this documentation. All technical decisions, beamforming corrections, model architecture choices, and reported results were reviewed, tested, and verified by the author, who can explain and reproduce all code submitted with this project.</w:t>
+      </w:r>
+    </w:p>
+    <w:p>
+      <w:pPr>
+        <w:spacing w:after="200" w:line="276" w:lineRule="auto"/>
+        <w:jc w:val="both"/>
+      </w:pPr>
+      <w:r>
+        <w:t>The public GitHub repository accompanying this report bundles a small 10-patient sample (5 malignant, 5 benign) from the OASBUD dataset under data/sample/, rather than the full 100-patient set, to keep the repository lightweight (approximately 31 MB) while still providing a class-balanced smoke test for reviewers. Reproducing the full results reported in this document requires the complete OASBUD dataset, downloadable from the source cited in the References section, pointed to via the OASBUD_PATH environment variable as described in the repository README.</w:t>
+      </w:r>
+    </w:p>
     <w:sectPr>
       <w:headerReference w:type="default" r:id="rId20"/>
       <w:footerReference w:type="default" r:id="rId21"/>
@@ -6273,7 +6332,7 @@
 </w:document>
 </file>
 
-<file path=word/endnotes.xml><?xml version="1.0" encoding="utf-8"?>
+<file path=word\endnotes.xml><?xml version="1.0" encoding="utf-8"?>
 <w:endnotes xmlns:wpc="http://schemas.microsoft.com/office/word/2010/wordprocessingCanvas" xmlns:cx="http://schemas.microsoft.com/office/drawing/2014/chartex" xmlns:cx1="http://schemas.microsoft.com/office/drawing/2015/9/8/chartex" xmlns:cx2="http://schemas.microsoft.com/office/drawing/2015/10/21/chartex" xmlns:cx3="http://schemas.microsoft.com/office/drawing/2016/5/9/chartex" xmlns:cx4="http://schemas.microsoft.com/office/drawing/2016/5/10/chartex" xmlns:cx5="http://schemas.microsoft.com/office/drawing/2016/5/11/chartex" xmlns:cx6="http://schemas.microsoft.com/office/drawing/2016/5/12/chartex" xmlns:cx7="http://schemas.microsoft.com/office/drawing/2016/5/13/chartex" xmlns:cx8="http://schemas.microsoft.com/office/drawing/2016/5/14/chartex" xmlns:mc="http://schemas.openxmlformats.org/markup-compatibility/2006" xmlns:aink="http://schemas.microsoft.com/office/drawing/2016/ink" xmlns:am3d="http://schemas.microsoft.com/office/drawing/2017/model3d" xmlns:o="urn:schemas-microsoft-com:office:office" xmlns:oel="http://schemas.microsoft.com/office/2019/extlst" xmlns:r="http://schemas.openxmlformats.org/officeDocument/2006/relationships" xmlns:m="http://schemas.openxmlformats.org/officeDocument/2006/math" xmlns:v="urn:schemas-microsoft-com:vml" xmlns:wp14="http://schemas.microsoft.com/office/word/2010/wordprocessingDrawing" xmlns:wp="http://schemas.openxmlformats.org/drawingml/2006/wordprocessingDrawing" xmlns:w10="urn:schemas-microsoft-com:office:word" xmlns:w="http://schemas.openxmlformats.org/wordprocessingml/2006/main" xmlns:w14="http://schemas.microsoft.com/office/word/2010/wordml" xmlns:w15="http://schemas.microsoft.com/office/word/2012/wordml" xmlns:w16cex="http://schemas.microsoft.com/office/word/2018/wordml/cex" xmlns:w16cid="http://schemas.microsoft.com/office/word/2016/wordml/cid" xmlns:w16="http://schemas.microsoft.com/office/word/2018/wordml" xmlns:w16du="http://schemas.microsoft.com/office/word/2023/wordml/word16du" xmlns:w16sdtdh="http://schemas.microsoft.com/office/word/2020/wordml/sdtdatahash" xmlns:w16sdtfl="http://schemas.microsoft.com/office/word/2024/wordml/sdtformatlock" xmlns:w16se="http://schemas.microsoft.com/office/word/2015/wordml/symex" xmlns:wpg="http://schemas.microsoft.com/office/word/2010/wordprocessingGroup" xmlns:wpi="http://schemas.microsoft.com/office/word/2010/wordprocessingInk" xmlns:wne="http://schemas.microsoft.com/office/word/2006/wordml" xmlns:wps="http://schemas.microsoft.com/office/word/2010/wordprocessingShape" mc:Ignorable="w14 w15 w16se w16cid w16 w16cex w16sdtdh w16sdtfl w16du wp14">
   <w:endnote w:type="separator" w:id="-1">
     <w:p>
@@ -6292,7 +6351,47 @@
 </w:endnotes>
 </file>
 
-<file path=word/footer1.xml><?xml version="1.0" encoding="utf-8"?>
+<file path=word\fontTable.xml><?xml version="1.0" encoding="utf-8"?>
+<w:fonts xmlns:mc="http://schemas.openxmlformats.org/markup-compatibility/2006" xmlns:r="http://schemas.openxmlformats.org/officeDocument/2006/relationships" xmlns:w="http://schemas.openxmlformats.org/wordprocessingml/2006/main" xmlns:w14="http://schemas.microsoft.com/office/word/2010/wordml" xmlns:w15="http://schemas.microsoft.com/office/word/2012/wordml" xmlns:w16cex="http://schemas.microsoft.com/office/word/2018/wordml/cex" xmlns:w16cid="http://schemas.microsoft.com/office/word/2016/wordml/cid" xmlns:w16="http://schemas.microsoft.com/office/word/2018/wordml" xmlns:w16du="http://schemas.microsoft.com/office/word/2023/wordml/word16du" xmlns:w16sdtdh="http://schemas.microsoft.com/office/word/2020/wordml/sdtdatahash" xmlns:w16sdtfl="http://schemas.microsoft.com/office/word/2024/wordml/sdtformatlock" xmlns:w16se="http://schemas.microsoft.com/office/word/2015/wordml/symex" mc:Ignorable="w14 w15 w16se w16cid w16 w16cex w16sdtdh w16sdtfl w16du">
+  <w:font w:name="Arial">
+    <w:panose1 w:val="020B0604020202020204"/>
+    <w:charset w:val="00"/>
+    <w:family w:val="swiss"/>
+    <w:pitch w:val="variable"/>
+    <w:sig w:usb0="E0002EFF" w:usb1="C000785B" w:usb2="00000009" w:usb3="00000000" w:csb0="000001FF" w:csb1="00000000"/>
+  </w:font>
+  <w:font w:name="Times New Roman">
+    <w:panose1 w:val="02020603050405020304"/>
+    <w:charset w:val="00"/>
+    <w:family w:val="roman"/>
+    <w:pitch w:val="variable"/>
+    <w:sig w:usb0="E0002EFF" w:usb1="C000785B" w:usb2="00000009" w:usb3="00000000" w:csb0="000001FF" w:csb1="00000000"/>
+  </w:font>
+  <w:font w:name="Courier New">
+    <w:panose1 w:val="02070309020205020404"/>
+    <w:charset w:val="00"/>
+    <w:family w:val="modern"/>
+    <w:pitch w:val="fixed"/>
+    <w:sig w:usb0="E0002EFF" w:usb1="C0007843" w:usb2="00000009" w:usb3="00000000" w:csb0="000001FF" w:csb1="00000000"/>
+  </w:font>
+  <w:font w:name="Calibri Light">
+    <w:panose1 w:val="020F0302020204030204"/>
+    <w:charset w:val="00"/>
+    <w:family w:val="swiss"/>
+    <w:pitch w:val="variable"/>
+    <w:sig w:usb0="E4002EFF" w:usb1="C200247B" w:usb2="00000009" w:usb3="00000000" w:csb0="000001FF" w:csb1="00000000"/>
+  </w:font>
+  <w:font w:name="Calibri">
+    <w:panose1 w:val="020F0502020204030204"/>
+    <w:charset w:val="00"/>
+    <w:family w:val="swiss"/>
+    <w:pitch w:val="variable"/>
+    <w:sig w:usb0="E4002EFF" w:usb1="C200247B" w:usb2="00000009" w:usb3="00000000" w:csb0="000001FF" w:csb1="00000000"/>
+  </w:font>
+</w:fonts>
+</file>
+
+<file path=word\footer1.xml><?xml version="1.0" encoding="utf-8"?>
 <w:ftr xmlns:wpc="http://schemas.microsoft.com/office/word/2010/wordprocessingCanvas" xmlns:cx="http://schemas.microsoft.com/office/drawing/2014/chartex" xmlns:cx1="http://schemas.microsoft.com/office/drawing/2015/9/8/chartex" xmlns:cx2="http://schemas.microsoft.com/office/drawing/2015/10/21/chartex" xmlns:cx3="http://schemas.microsoft.com/office/drawing/2016/5/9/chartex" xmlns:cx4="http://schemas.microsoft.com/office/drawing/2016/5/10/chartex" xmlns:cx5="http://schemas.microsoft.com/office/drawing/2016/5/11/chartex" xmlns:cx6="http://schemas.microsoft.com/office/drawing/2016/5/12/chartex" xmlns:cx7="http://schemas.microsoft.com/office/drawing/2016/5/13/chartex" xmlns:cx8="http://schemas.microsoft.com/office/drawing/2016/5/14/chartex" xmlns:mc="http://schemas.openxmlformats.org/markup-compatibility/2006" xmlns:aink="http://schemas.microsoft.com/office/drawing/2016/ink" xmlns:am3d="http://schemas.microsoft.com/office/drawing/2017/model3d" xmlns:o="urn:schemas-microsoft-com:office:office" xmlns:oel="http://schemas.microsoft.com/office/2019/extlst" xmlns:r="http://schemas.openxmlformats.org/officeDocument/2006/relationships" xmlns:m="http://schemas.openxmlformats.org/officeDocument/2006/math" xmlns:v="urn:schemas-microsoft-com:vml" xmlns:wp14="http://schemas.microsoft.com/office/word/2010/wordprocessingDrawing" xmlns:wp="http://schemas.openxmlformats.org/drawingml/2006/wordprocessingDrawing" xmlns:w10="urn:schemas-microsoft-com:office:word" xmlns:w="http://schemas.openxmlformats.org/wordprocessingml/2006/main" xmlns:w14="http://schemas.microsoft.com/office/word/2010/wordml" xmlns:w15="http://schemas.microsoft.com/office/word/2012/wordml" xmlns:w16cex="http://schemas.microsoft.com/office/word/2018/wordml/cex" xmlns:w16cid="http://schemas.microsoft.com/office/word/2016/wordml/cid" xmlns:w16="http://schemas.microsoft.com/office/word/2018/wordml" xmlns:w16du="http://schemas.microsoft.com/office/word/2023/wordml/word16du" xmlns:w16sdtdh="http://schemas.microsoft.com/office/word/2020/wordml/sdtdatahash" xmlns:w16sdtfl="http://schemas.microsoft.com/office/word/2024/wordml/sdtformatlock" xmlns:w16se="http://schemas.microsoft.com/office/word/2015/wordml/symex" xmlns:wpg="http://schemas.microsoft.com/office/word/2010/wordprocessingGroup" xmlns:wpi="http://schemas.microsoft.com/office/word/2010/wordprocessingInk" xmlns:wne="http://schemas.microsoft.com/office/word/2006/wordml" xmlns:wps="http://schemas.microsoft.com/office/word/2010/wordprocessingShape" mc:Ignorable="w14 w15 w16se w16cid w16 w16cex w16sdtdh w16sdtfl w16du wp14">
   <w:p>
     <w:pPr>
@@ -6345,7 +6444,7 @@
 </w:ftr>
 </file>
 
-<file path=word/footnotes.xml><?xml version="1.0" encoding="utf-8"?>
+<file path=word\footnotes.xml><?xml version="1.0" encoding="utf-8"?>
 <w:footnotes xmlns:wpc="http://schemas.microsoft.com/office/word/2010/wordprocessingCanvas" xmlns:cx="http://schemas.microsoft.com/office/drawing/2014/chartex" xmlns:cx1="http://schemas.microsoft.com/office/drawing/2015/9/8/chartex" xmlns:cx2="http://schemas.microsoft.com/office/drawing/2015/10/21/chartex" xmlns:cx3="http://schemas.microsoft.com/office/drawing/2016/5/9/chartex" xmlns:cx4="http://schemas.microsoft.com/office/drawing/2016/5/10/chartex" xmlns:cx5="http://schemas.microsoft.com/office/drawing/2016/5/11/chartex" xmlns:cx6="http://schemas.microsoft.com/office/drawing/2016/5/12/chartex" xmlns:cx7="http://schemas.microsoft.com/office/drawing/2016/5/13/chartex" xmlns:cx8="http://schemas.microsoft.com/office/drawing/2016/5/14/chartex" xmlns:mc="http://schemas.openxmlformats.org/markup-compatibility/2006" xmlns:aink="http://schemas.microsoft.com/office/drawing/2016/ink" xmlns:am3d="http://schemas.microsoft.com/office/drawing/2017/model3d" xmlns:o="urn:schemas-microsoft-com:office:office" xmlns:oel="http://schemas.microsoft.com/office/2019/extlst" xmlns:r="http://schemas.openxmlformats.org/officeDocument/2006/relationships" xmlns:m="http://schemas.openxmlformats.org/officeDocument/2006/math" xmlns:v="urn:schemas-microsoft-com:vml" xmlns:wp14="http://schemas.microsoft.com/office/word/2010/wordprocessingDrawing" xmlns:wp="http://schemas.openxmlformats.org/drawingml/2006/wordprocessingDrawing" xmlns:w10="urn:schemas-microsoft-com:office:word" xmlns:w="http://schemas.openxmlformats.org/wordprocessingml/2006/main" xmlns:w14="http://schemas.microsoft.com/office/word/2010/wordml" xmlns:w15="http://schemas.microsoft.com/office/word/2012/wordml" xmlns:w16cex="http://schemas.microsoft.com/office/word/2018/wordml/cex" xmlns:w16cid="http://schemas.microsoft.com/office/word/2016/wordml/cid" xmlns:w16="http://schemas.microsoft.com/office/word/2018/wordml" xmlns:w16du="http://schemas.microsoft.com/office/word/2023/wordml/word16du" xmlns:w16sdtdh="http://schemas.microsoft.com/office/word/2020/wordml/sdtdatahash" xmlns:w16sdtfl="http://schemas.microsoft.com/office/word/2024/wordml/sdtformatlock" xmlns:w16se="http://schemas.microsoft.com/office/word/2015/wordml/symex" xmlns:wpg="http://schemas.microsoft.com/office/word/2010/wordprocessingGroup" xmlns:wpi="http://schemas.microsoft.com/office/word/2010/wordprocessingInk" xmlns:wne="http://schemas.microsoft.com/office/word/2006/wordml" xmlns:wps="http://schemas.microsoft.com/office/word/2010/wordprocessingShape" mc:Ignorable="w14 w15 w16se w16cid w16 w16cex w16sdtdh w16sdtfl w16du wp14">
   <w:footnote w:type="separator" w:id="-1">
     <w:p>
@@ -6364,7 +6463,7 @@
 </w:footnotes>
 </file>
 
-<file path=word/header1.xml><?xml version="1.0" encoding="utf-8"?>
+<file path=word\header1.xml><?xml version="1.0" encoding="utf-8"?>
 <w:hdr xmlns:wpc="http://schemas.microsoft.com/office/word/2010/wordprocessingCanvas" xmlns:cx="http://schemas.microsoft.com/office/drawing/2014/chartex" xmlns:cx1="http://schemas.microsoft.com/office/drawing/2015/9/8/chartex" xmlns:cx2="http://schemas.microsoft.com/office/drawing/2015/10/21/chartex" xmlns:cx3="http://schemas.microsoft.com/office/drawing/2016/5/9/chartex" xmlns:cx4="http://schemas.microsoft.com/office/drawing/2016/5/10/chartex" xmlns:cx5="http://schemas.microsoft.com/office/drawing/2016/5/11/chartex" xmlns:cx6="http://schemas.microsoft.com/office/drawing/2016/5/12/chartex" xmlns:cx7="http://schemas.microsoft.com/office/drawing/2016/5/13/chartex" xmlns:cx8="http://schemas.microsoft.com/office/drawing/2016/5/14/chartex" xmlns:mc="http://schemas.openxmlformats.org/markup-compatibility/2006" xmlns:aink="http://schemas.microsoft.com/office/drawing/2016/ink" xmlns:am3d="http://schemas.microsoft.com/office/drawing/2017/model3d" xmlns:o="urn:schemas-microsoft-com:office:office" xmlns:oel="http://schemas.microsoft.com/office/2019/extlst" xmlns:r="http://schemas.openxmlformats.org/officeDocument/2006/relationships" xmlns:m="http://schemas.openxmlformats.org/officeDocument/2006/math" xmlns:v="urn:schemas-microsoft-com:vml" xmlns:wp14="http://schemas.microsoft.com/office/word/2010/wordprocessingDrawing" xmlns:wp="http://schemas.openxmlformats.org/drawingml/2006/wordprocessingDrawing" xmlns:w10="urn:schemas-microsoft-com:office:word" xmlns:w="http://schemas.openxmlformats.org/wordprocessingml/2006/main" xmlns:w14="http://schemas.microsoft.com/office/word/2010/wordml" xmlns:w15="http://schemas.microsoft.com/office/word/2012/wordml" xmlns:w16cex="http://schemas.microsoft.com/office/word/2018/wordml/cex" xmlns:w16cid="http://schemas.microsoft.com/office/word/2016/wordml/cid" xmlns:w16="http://schemas.microsoft.com/office/word/2018/wordml" xmlns:w16du="http://schemas.microsoft.com/office/word/2023/wordml/word16du" xmlns:w16sdtdh="http://schemas.microsoft.com/office/word/2020/wordml/sdtdatahash" xmlns:w16sdtfl="http://schemas.microsoft.com/office/word/2024/wordml/sdtformatlock" xmlns:w16se="http://schemas.microsoft.com/office/word/2015/wordml/symex" xmlns:wpg="http://schemas.microsoft.com/office/word/2010/wordprocessingGroup" xmlns:wpi="http://schemas.microsoft.com/office/word/2010/wordprocessingInk" xmlns:wne="http://schemas.microsoft.com/office/word/2006/wordml" xmlns:wps="http://schemas.microsoft.com/office/word/2010/wordprocessingShape" mc:Ignorable="w14 w15 w16se w16cid w16 w16cex w16sdtdh w16sdtfl w16du wp14">
   <w:p>
     <w:pPr>
@@ -6384,7 +6483,7 @@
 </w:hdr>
 </file>
 
-<file path=word/numbering.xml><?xml version="1.0" encoding="utf-8"?>
+<file path=word\numbering.xml><?xml version="1.0" encoding="utf-8"?>
 <w:numbering xmlns:wpc="http://schemas.microsoft.com/office/word/2010/wordprocessingCanvas" xmlns:cx="http://schemas.microsoft.com/office/drawing/2014/chartex" xmlns:cx1="http://schemas.microsoft.com/office/drawing/2015/9/8/chartex" xmlns:cx2="http://schemas.microsoft.com/office/drawing/2015/10/21/chartex" xmlns:cx3="http://schemas.microsoft.com/office/drawing/2016/5/9/chartex" xmlns:cx4="http://schemas.microsoft.com/office/drawing/2016/5/10/chartex" xmlns:cx5="http://schemas.microsoft.com/office/drawing/2016/5/11/chartex" xmlns:cx6="http://schemas.microsoft.com/office/drawing/2016/5/12/chartex" xmlns:cx7="http://schemas.microsoft.com/office/drawing/2016/5/13/chartex" xmlns:cx8="http://schemas.microsoft.com/office/drawing/2016/5/14/chartex" xmlns:mc="http://schemas.openxmlformats.org/markup-compatibility/2006" xmlns:aink="http://schemas.microsoft.com/office/drawing/2016/ink" xmlns:am3d="http://schemas.microsoft.com/office/drawing/2017/model3d" xmlns:o="urn:schemas-microsoft-com:office:office" xmlns:oel="http://schemas.microsoft.com/office/2019/extlst" xmlns:r="http://schemas.openxmlformats.org/officeDocument/2006/relationships" xmlns:m="http://schemas.openxmlformats.org/officeDocument/2006/math" xmlns:v="urn:schemas-microsoft-com:vml" xmlns:wp14="http://schemas.microsoft.com/office/word/2010/wordprocessingDrawing" xmlns:wp="http://schemas.openxmlformats.org/drawingml/2006/wordprocessingDrawing" xmlns:w10="urn:schemas-microsoft-com:office:word" xmlns:w="http://schemas.openxmlformats.org/wordprocessingml/2006/main" xmlns:w14="http://schemas.microsoft.com/office/word/2010/wordml" xmlns:w15="http://schemas.microsoft.com/office/word/2012/wordml" xmlns:w16cex="http://schemas.microsoft.com/office/word/2018/wordml/cex" xmlns:w16cid="http://schemas.microsoft.com/office/word/2016/wordml/cid" xmlns:w16="http://schemas.microsoft.com/office/word/2018/wordml" xmlns:w16du="http://schemas.microsoft.com/office/word/2023/wordml/word16du" xmlns:w16sdtdh="http://schemas.microsoft.com/office/word/2020/wordml/sdtdatahash" xmlns:w16sdtfl="http://schemas.microsoft.com/office/word/2024/wordml/sdtformatlock" xmlns:w16se="http://schemas.microsoft.com/office/word/2015/wordml/symex" xmlns:wpg="http://schemas.microsoft.com/office/word/2010/wordprocessingGroup" xmlns:wpi="http://schemas.microsoft.com/office/word/2010/wordprocessingInk" xmlns:wne="http://schemas.microsoft.com/office/word/2006/wordml" xmlns:wps="http://schemas.microsoft.com/office/word/2010/wordprocessingShape" mc:Ignorable="w14 w15 w16se w16cid w16 w16cex w16sdtdh w16sdtfl w16du wp14">
   <w:abstractNum w:abstractNumId="0" w15:restartNumberingAfterBreak="0">
     <w:nsid w:val="11B047CC"/>
@@ -6481,7 +6580,73 @@
 </w:numbering>
 </file>
 
-<file path=word/styles.xml><?xml version="1.0" encoding="utf-8"?>
+<file path=word\settings.xml><?xml version="1.0" encoding="utf-8"?>
+<w:settings xmlns:mc="http://schemas.openxmlformats.org/markup-compatibility/2006" xmlns:o="urn:schemas-microsoft-com:office:office" xmlns:r="http://schemas.openxmlformats.org/officeDocument/2006/relationships" xmlns:m="http://schemas.openxmlformats.org/officeDocument/2006/math" xmlns:v="urn:schemas-microsoft-com:vml" xmlns:w10="urn:schemas-microsoft-com:office:word" xmlns:w="http://schemas.openxmlformats.org/wordprocessingml/2006/main" xmlns:w14="http://schemas.microsoft.com/office/word/2010/wordml" xmlns:w15="http://schemas.microsoft.com/office/word/2012/wordml" xmlns:w16cex="http://schemas.microsoft.com/office/word/2018/wordml/cex" xmlns:w16cid="http://schemas.microsoft.com/office/word/2016/wordml/cid" xmlns:w16="http://schemas.microsoft.com/office/word/2018/wordml" xmlns:w16du="http://schemas.microsoft.com/office/word/2023/wordml/word16du" xmlns:w16sdtdh="http://schemas.microsoft.com/office/word/2020/wordml/sdtdatahash" xmlns:w16sdtfl="http://schemas.microsoft.com/office/word/2024/wordml/sdtformatlock" xmlns:w16se="http://schemas.microsoft.com/office/word/2015/wordml/symex" xmlns:sl="http://schemas.openxmlformats.org/schemaLibrary/2006/main" mc:Ignorable="w14 w15 w16se w16cid w16 w16cex w16sdtdh w16sdtfl w16du">
+  <w:zoom w:percent="100"/>
+  <w:displayBackgroundShape/>
+  <w:defaultTabStop w:val="720"/>
+  <w:characterSpacingControl w:val="doNotCompress"/>
+  <w:footnotePr>
+    <w:footnote w:id="-1"/>
+    <w:footnote w:id="0"/>
+  </w:footnotePr>
+  <w:endnotePr>
+    <w:endnote w:id="-1"/>
+    <w:endnote w:id="0"/>
+  </w:endnotePr>
+  <w:compat>
+    <w:compatSetting w:name="compatibilityMode" w:uri="http://schemas.microsoft.com/office/word" w:val="15"/>
+    <w:compatSetting w:name="overrideTableStyleFontSizeAndJustification" w:uri="http://schemas.microsoft.com/office/word" w:val="1"/>
+    <w:compatSetting w:name="enableOpenTypeFeatures" w:uri="http://schemas.microsoft.com/office/word" w:val="1"/>
+    <w:compatSetting w:name="doNotFlipMirrorIndents" w:uri="http://schemas.microsoft.com/office/word" w:val="1"/>
+    <w:compatSetting w:name="differentiateMultirowTableHeaders" w:uri="http://schemas.microsoft.com/office/word" w:val="1"/>
+    <w:compatSetting w:name="useWord2013TrackBottomHyphenation" w:uri="http://schemas.microsoft.com/office/word" w:val="1"/>
+  </w:compat>
+  <w:rsids>
+    <w:rsidRoot w:val="009C6AC1"/>
+    <w:rsid w:val="002D071D"/>
+    <w:rsid w:val="003B19F1"/>
+    <w:rsid w:val="00637785"/>
+    <w:rsid w:val="00726364"/>
+    <w:rsid w:val="009537E0"/>
+    <w:rsid w:val="009C6AC1"/>
+    <w:rsid w:val="009E50C3"/>
+    <w:rsid w:val="00A15952"/>
+    <w:rsid w:val="00AC6F2D"/>
+    <w:rsid w:val="00B63414"/>
+    <w:rsid w:val="00E64B9C"/>
+    <w:rsid w:val="00F02F85"/>
+    <w:rsid w:val="00F82733"/>
+  </w:rsids>
+  <m:mathPr>
+    <m:mathFont m:val="Cambria Math"/>
+    <m:brkBin m:val="before"/>
+    <m:brkBinSub m:val="--"/>
+    <m:smallFrac m:val="0"/>
+    <m:dispDef/>
+    <m:lMargin m:val="0"/>
+    <m:rMargin m:val="0"/>
+    <m:defJc m:val="centerGroup"/>
+    <m:wrapIndent m:val="1440"/>
+    <m:intLim m:val="subSup"/>
+    <m:naryLim m:val="undOvr"/>
+  </m:mathPr>
+  <w:themeFontLang w:val="en-IN"/>
+  <w:clrSchemeMapping w:bg1="light1" w:t1="dark1" w:bg2="light2" w:t2="dark2" w:accent1="accent1" w:accent2="accent2" w:accent3="accent3" w:accent4="accent4" w:accent5="accent5" w:accent6="accent6" w:hyperlink="hyperlink" w:followedHyperlink="followedHyperlink"/>
+  <w:shapeDefaults>
+    <o:shapedefaults v:ext="edit" spidmax="1026"/>
+    <o:shapelayout v:ext="edit">
+      <o:idmap v:ext="edit" data="1"/>
+    </o:shapelayout>
+  </w:shapeDefaults>
+  <w:decimalSymbol w:val="."/>
+  <w:listSeparator w:val=","/>
+  <w14:docId w14:val="7F307C39"/>
+  <w15:docId w15:val="{B504292E-7D82-4416-B323-22540684F117}"/>
+</w:settings>
+</file>
+
+<file path=word\styles.xml><?xml version="1.0" encoding="utf-8"?>
 <w:styles xmlns:mc="http://schemas.openxmlformats.org/markup-compatibility/2006" xmlns:r="http://schemas.openxmlformats.org/officeDocument/2006/relationships" xmlns:w="http://schemas.openxmlformats.org/wordprocessingml/2006/main" xmlns:w14="http://schemas.microsoft.com/office/word/2010/wordml" xmlns:w15="http://schemas.microsoft.com/office/word/2012/wordml" xmlns:w16cex="http://schemas.microsoft.com/office/word/2018/wordml/cex" xmlns:w16cid="http://schemas.microsoft.com/office/word/2016/wordml/cid" xmlns:w16="http://schemas.microsoft.com/office/word/2018/wordml" xmlns:w16du="http://schemas.microsoft.com/office/word/2023/wordml/word16du" xmlns:w16sdtdh="http://schemas.microsoft.com/office/word/2020/wordml/sdtdatahash" xmlns:w16sdtfl="http://schemas.microsoft.com/office/word/2024/wordml/sdtformatlock" xmlns:w16se="http://schemas.microsoft.com/office/word/2015/wordml/symex" mc:Ignorable="w14 w15 w16se w16cid w16 w16cex w16sdtdh w16sdtfl w16du">
   <w:docDefaults>
     <w:rPrDefault>
@@ -7128,7 +7293,7 @@
 </w:styles>
 </file>
 
-<file path=word/theme/theme1.xml><?xml version="1.0" encoding="utf-8"?>
+<file path=word\theme\theme1.xml><?xml version="1.0" encoding="utf-8"?>
 <a:theme xmlns:a="http://schemas.openxmlformats.org/drawingml/2006/main" name="Office Theme">
   <a:themeElements>
     <a:clrScheme name="Office">
@@ -7421,4 +7586,11 @@
     </a:ext>
   </a:extLst>
 </a:theme>
+</file>
+
+<file path=word\webSettings.xml><?xml version="1.0" encoding="utf-8"?>
+<w:webSettings xmlns:mc="http://schemas.openxmlformats.org/markup-compatibility/2006" xmlns:r="http://schemas.openxmlformats.org/officeDocument/2006/relationships" xmlns:w="http://schemas.openxmlformats.org/wordprocessingml/2006/main" xmlns:w14="http://schemas.microsoft.com/office/word/2010/wordml" xmlns:w15="http://schemas.microsoft.com/office/word/2012/wordml" xmlns:w16cex="http://schemas.microsoft.com/office/word/2018/wordml/cex" xmlns:w16cid="http://schemas.microsoft.com/office/word/2016/wordml/cid" xmlns:w16="http://schemas.microsoft.com/office/word/2018/wordml" xmlns:w16du="http://schemas.microsoft.com/office/word/2023/wordml/word16du" xmlns:w16sdtdh="http://schemas.microsoft.com/office/word/2020/wordml/sdtdatahash" xmlns:w16sdtfl="http://schemas.microsoft.com/office/word/2024/wordml/sdtformatlock" xmlns:w16se="http://schemas.microsoft.com/office/word/2015/wordml/symex" mc:Ignorable="w14 w15 w16se w16cid w16 w16cex w16sdtdh w16sdtfl w16du">
+  <w:relyOnVML/>
+  <w:allowPNG/>
+</w:webSettings>
 </file>
</xml_diff>

<commit_message>
Add functional Simulink subsystem, executive summary, and results interpretation table
Simulink:
- Add UltrasoundEnhancementSubsystem.slx: functional model with MATLAB Function
  blocks for EnvelopeDetection (Hilbert transform, 20log10, normalisation) and
  Enhancement (3x3 median filter). Simulated in MATLAB R2024b with MSVC 2022.
  Output: 1824x510 B-mode image, values 0-253.
- Add Project Figures/Simulink_Functional_Output.png: simulation output figure

Project_Documentation.docx:
- Add Executive Summary page (table: Problem, Solution, Tools, Innovation,
  Results, Limitations, Repository) before Section 1 Abstract
- Add Section 6.1a results interpretation table (87.37% / 73% / ~58%)
- Reframe all Simulink references to reflect functional subsystem model

README.md:
- Update Simulink section to document both models accurately
- Update repository structure to list UltrasoundEnhancementSubsystem.slx
- Add functional output figure reference
</commit_message>
<xml_diff>
--- a/Project_Documentation.docx
+++ b/Project_Documentation.docx
@@ -250,6 +250,430 @@
                 <w:rStyle w:val="Hyperlink"/>
                 <w:noProof/>
               </w:rPr>
+              <w:p>
+                <w:pPr>
+                  <w:pStyle w:val="Heading1"/>
+                </w:pPr>
+                <w:bookmarkStart w:id="41" w:name="_Toc233174921"/>
+                <w:r>
+                  <w:lastRenderedPageBreak/>
+                  <w:t>Executive Summary</w:t>
+                </w:r>
+                <w:bookmarkEnd w:id="41"/>
+              </w:p>
+              <w:tbl>
+                <w:tblPr>
+                  <w:tblW w:w="9360" w:type="dxa"/>
+                  <w:tblBorders>
+                    <w:top w:val="single" w:sz="6" w:space="0" w:color="2E75B6"/>
+                    <w:left w:val="single" w:sz="6" w:space="0" w:color="2E75B6"/>
+                    <w:bottom w:val="single" w:sz="6" w:space="0" w:color="2E75B6"/>
+                    <w:right w:val="single" w:sz="6" w:space="0" w:color="2E75B6"/>
+                    <w:insideH w:val="single" w:sz="4" w:space="0" w:color="CCCCCC"/>
+                    <w:insideV w:val="single" w:sz="4" w:space="0" w:color="CCCCCC"/>
+                  </w:tblBorders>
+                  <w:tblCellMar>
+                    <w:top w:w="120" w:type="dxa"/>
+                    <w:left w:w="160" w:type="dxa"/>
+                    <w:bottom w:w="120" w:type="dxa"/>
+                    <w:right w:w="160" w:type="dxa"/>
+                  </w:tblCellMar>
+                </w:tblPr>
+                <w:tblGrid>
+                  <w:gridCol w:w="1800"/>
+                  <w:gridCol w:w="7560"/>
+                </w:tblGrid>
+                <w:tr>
+                  <w:tc>
+                    <w:tcPr>
+                      <w:tcW w:w="1800" w:type="dxa"/>
+                      <w:tcBorders>
+                        <w:top w:val="single" w:sz="4" w:space="0" w:color="CCCCCC"/>
+                        <w:left w:val="single" w:sz="4" w:space="0" w:color="CCCCCC"/>
+                        <w:bottom w:val="single" w:sz="4" w:space="0" w:color="CCCCCC"/>
+                        <w:right w:val="single" w:sz="4" w:space="0" w:color="CCCCCC"/>
+                      </w:tcBorders>
+                      <w:shd w:val="clear" w:color="auto" w:fill="D5E8F0"/>
+                      <w:tcMar>
+                        <w:top w:w="80" w:type="dxa"/>
+                        <w:left w:w="120" w:type="dxa"/>
+                        <w:bottom w:w="80" w:type="dxa"/>
+                        <w:right w:w="120" w:type="dxa"/>
+                      </w:tcMar>
+                    </w:tcPr>
+                    <w:p>
+                      <w:r>
+                        <w:rPr>
+                          <w:b/>
+                          <w:sz w:val="18"/>
+                        </w:rPr>
+                        <w:t xml:space="preserve">Problem</w:t>
+                      </w:r>
+                    </w:p>
+                  </w:tc>
+                  <w:tc>
+                    <w:tcPr>
+                      <w:tcW w:w="7560" w:type="dxa"/>
+                      <w:tcBorders>
+                        <w:top w:val="single" w:sz="4" w:space="0" w:color="CCCCCC"/>
+                        <w:left w:val="single" w:sz="4" w:space="0" w:color="CCCCCC"/>
+                        <w:bottom w:val="single" w:sz="4" w:space="0" w:color="CCCCCC"/>
+                        <w:right w:val="single" w:sz="4" w:space="0" w:color="CCCCCC"/>
+                      </w:tcBorders>
+                      <w:shd w:val="clear" w:color="auto" w:fill="FFFFFF"/>
+                      <w:tcMar>
+                        <w:top w:w="80" w:type="dxa"/>
+                        <w:left w:w="120" w:type="dxa"/>
+                        <w:bottom w:w="80" w:type="dxa"/>
+                        <w:right w:w="120" w:type="dxa"/>
+                      </w:tcMar>
+                    </w:tcPr>
+                    <w:p>
+                      <w:r>
+                        <w:rPr>
+                          <w:sz w:val="18"/>
+                        </w:rPr>
+                        <w:t xml:space="preserve">Breast cancer is the most frequently diagnosed cancer worldwide. Real-time AI-assisted classification of raw RF ultrasound data remains an open challenge, requiring GPU-accelerated processing to achieve clinically useful frame rates.</w:t>
+                      </w:r>
+                    </w:p>
+                  </w:tc>
+                </w:tr>
+                <w:tr>
+                  <w:tc>
+                    <w:tcPr>
+                      <w:tcW w:w="1800" w:type="dxa"/>
+                      <w:tcBorders>
+                        <w:top w:val="single" w:sz="4" w:space="0" w:color="CCCCCC"/>
+                        <w:left w:val="single" w:sz="4" w:space="0" w:color="CCCCCC"/>
+                        <w:bottom w:val="single" w:sz="4" w:space="0" w:color="CCCCCC"/>
+                        <w:right w:val="single" w:sz="4" w:space="0" w:color="CCCCCC"/>
+                      </w:tcBorders>
+                      <w:shd w:val="clear" w:color="auto" w:fill="D5E8F0"/>
+                      <w:tcMar>
+                        <w:top w:w="80" w:type="dxa"/>
+                        <w:left w:w="120" w:type="dxa"/>
+                        <w:bottom w:w="80" w:type="dxa"/>
+                        <w:right w:w="120" w:type="dxa"/>
+                      </w:tcMar>
+                    </w:tcPr>
+                    <w:p>
+                      <w:r>
+                        <w:rPr>
+                          <w:b/>
+                          <w:sz w:val="18"/>
+                        </w:rPr>
+                        <w:t xml:space="preserve">Proposed Solution</w:t>
+                      </w:r>
+                    </w:p>
+                  </w:tc>
+                  <w:tc>
+                    <w:tcPr>
+                      <w:tcW w:w="7560" w:type="dxa"/>
+                      <w:tcBorders>
+                        <w:top w:val="single" w:sz="4" w:space="0" w:color="CCCCCC"/>
+                        <w:left w:val="single" w:sz="4" w:space="0" w:color="CCCCCC"/>
+                        <w:bottom w:val="single" w:sz="4" w:space="0" w:color="CCCCCC"/>
+                        <w:right w:val="single" w:sz="4" w:space="0" w:color="CCCCCC"/>
+                      </w:tcBorders>
+                      <w:shd w:val="clear" w:color="auto" w:fill="FFFFFF"/>
+                      <w:tcMar>
+                        <w:top w:w="80" w:type="dxa"/>
+                        <w:left w:w="120" w:type="dxa"/>
+                        <w:bottom w:w="80" w:type="dxa"/>
+                        <w:right w:w="120" w:type="dxa"/>
+                      </w:tcMar>
+                    </w:tcPr>
+                    <w:p>
+                      <w:r>
+                        <w:rPr>
+                          <w:sz w:val="18"/>
+                        </w:rPr>
+                        <w:t xml:space="preserve">A six-stage real-time pipeline: raw OASBUD RF data beamformed via DAS (GPU Coder-generated CUDA kernel), log-compressed via Hilbert envelope detection, enhanced with a 3x3 median filter (validated in functional Simulink subsystem), classified by MobileNetV2 CNN (4,429 images across 5 datasets), deployed via NVIDIA Holoscan SDK.</w:t>
+                      </w:r>
+                    </w:p>
+                  </w:tc>
+                </w:tr>
+                <w:tr>
+                  <w:tc>
+                    <w:tcPr>
+                      <w:tcW w:w="1800" w:type="dxa"/>
+                      <w:tcBorders>
+                        <w:top w:val="single" w:sz="4" w:space="0" w:color="CCCCCC"/>
+                        <w:left w:val="single" w:sz="4" w:space="0" w:color="CCCCCC"/>
+                        <w:bottom w:val="single" w:sz="4" w:space="0" w:color="CCCCCC"/>
+                        <w:right w:val="single" w:sz="4" w:space="0" w:color="CCCCCC"/>
+                      </w:tcBorders>
+                      <w:shd w:val="clear" w:color="auto" w:fill="D5E8F0"/>
+                      <w:tcMar>
+                        <w:top w:w="80" w:type="dxa"/>
+                        <w:left w:w="120" w:type="dxa"/>
+                        <w:bottom w:w="80" w:type="dxa"/>
+                        <w:right w:w="120" w:type="dxa"/>
+                      </w:tcMar>
+                    </w:tcPr>
+                    <w:p>
+                      <w:r>
+                        <w:rPr>
+                          <w:b/>
+                          <w:sz w:val="18"/>
+                        </w:rPr>
+                        <w:t xml:space="preserve">Tools Used</w:t>
+                      </w:r>
+                    </w:p>
+                  </w:tc>
+                  <w:tc>
+                    <w:tcPr>
+                      <w:tcW w:w="7560" w:type="dxa"/>
+                      <w:tcBorders>
+                        <w:top w:val="single" w:sz="4" w:space="0" w:color="CCCCCC"/>
+                        <w:left w:val="single" w:sz="4" w:space="0" w:color="CCCCCC"/>
+                        <w:bottom w:val="single" w:sz="4" w:space="0" w:color="CCCCCC"/>
+                        <w:right w:val="single" w:sz="4" w:space="0" w:color="CCCCCC"/>
+                      </w:tcBorders>
+                      <w:shd w:val="clear" w:color="auto" w:fill="FFFFFF"/>
+                      <w:tcMar>
+                        <w:top w:w="80" w:type="dxa"/>
+                        <w:left w:w="120" w:type="dxa"/>
+                        <w:bottom w:w="80" w:type="dxa"/>
+                        <w:right w:w="120" w:type="dxa"/>
+                      </w:tcMar>
+                    </w:tcPr>
+                    <w:p>
+                      <w:r>
+                        <w:rPr>
+                          <w:sz w:val="18"/>
+                        </w:rPr>
+                        <w:t xml:space="preserve">MATLAB R2024b (Deep Learning Toolbox, GPU Coder, Image Processing Toolbox, Simulink), Python 3.10, Holoscan SDK 4.2.0, ONNX Runtime GPU, CUDA 12.6, VS2022, RTX 4070 Laptop GPU (8 GB VRAM, CC 8.9).</w:t>
+                      </w:r>
+                    </w:p>
+                  </w:tc>
+                </w:tr>
+                <w:tr>
+                  <w:tc>
+                    <w:tcPr>
+                      <w:tcW w:w="1800" w:type="dxa"/>
+                      <w:tcBorders>
+                        <w:top w:val="single" w:sz="4" w:space="0" w:color="CCCCCC"/>
+                        <w:left w:val="single" w:sz="4" w:space="0" w:color="CCCCCC"/>
+                        <w:bottom w:val="single" w:sz="4" w:space="0" w:color="CCCCCC"/>
+                        <w:right w:val="single" w:sz="4" w:space="0" w:color="CCCCCC"/>
+                      </w:tcBorders>
+                      <w:shd w:val="clear" w:color="auto" w:fill="D5E8F0"/>
+                      <w:tcMar>
+                        <w:top w:w="80" w:type="dxa"/>
+                        <w:left w:w="120" w:type="dxa"/>
+                        <w:bottom w:w="80" w:type="dxa"/>
+                        <w:right w:w="120" w:type="dxa"/>
+                      </w:tcMar>
+                    </w:tcPr>
+                    <w:p>
+                      <w:r>
+                        <w:rPr>
+                          <w:b/>
+                          <w:sz w:val="18"/>
+                        </w:rPr>
+                        <w:t xml:space="preserve">Key Innovation</w:t>
+                      </w:r>
+                    </w:p>
+                  </w:tc>
+                  <w:tc>
+                    <w:tcPr>
+                      <w:tcW w:w="7560" w:type="dxa"/>
+                      <w:tcBorders>
+                        <w:top w:val="single" w:sz="4" w:space="0" w:color="CCCCCC"/>
+                        <w:left w:val="single" w:sz="4" w:space="0" w:color="CCCCCC"/>
+                        <w:bottom w:val="single" w:sz="4" w:space="0" w:color="CCCCCC"/>
+                        <w:right w:val="single" w:sz="4" w:space="0" w:color="CCCCCC"/>
+                      </w:tcBorders>
+                      <w:shd w:val="clear" w:color="auto" w:fill="FFFFFF"/>
+                      <w:tcMar>
+                        <w:top w:w="80" w:type="dxa"/>
+                        <w:left w:w="120" w:type="dxa"/>
+                        <w:bottom w:w="80" w:type="dxa"/>
+                        <w:right w:w="120" w:type="dxa"/>
+                      </w:tcMar>
+                    </w:tcPr>
+                    <w:p>
+                      <w:r>
+                        <w:rPr>
+                          <w:sz w:val="18"/>
+                        </w:rPr>
+                        <w:t xml:space="preserve">GPU Coder CUDA kernel parallelises 60,000 pixels simultaneously. Five-dataset combined training corpus (4,429 images). Functional Simulink subsystem validates image processing stages. GreedyScheduler Holoscan pipeline achieves 34 fps end-to-end on RTX 4070 Laptop GPU.</w:t>
+                      </w:r>
+                    </w:p>
+                  </w:tc>
+                </w:tr>
+                <w:tr>
+                  <w:tc>
+                    <w:tcPr>
+                      <w:tcW w:w="1800" w:type="dxa"/>
+                      <w:tcBorders>
+                        <w:top w:val="single" w:sz="4" w:space="0" w:color="CCCCCC"/>
+                        <w:left w:val="single" w:sz="4" w:space="0" w:color="CCCCCC"/>
+                        <w:bottom w:val="single" w:sz="4" w:space="0" w:color="CCCCCC"/>
+                        <w:right w:val="single" w:sz="4" w:space="0" w:color="CCCCCC"/>
+                      </w:tcBorders>
+                      <w:shd w:val="clear" w:color="auto" w:fill="D5E8F0"/>
+                      <w:tcMar>
+                        <w:top w:w="80" w:type="dxa"/>
+                        <w:left w:w="120" w:type="dxa"/>
+                        <w:bottom w:w="80" w:type="dxa"/>
+                        <w:right w:w="120" w:type="dxa"/>
+                      </w:tcMar>
+                    </w:tcPr>
+                    <w:p>
+                      <w:r>
+                        <w:rPr>
+                          <w:b/>
+                          <w:sz w:val="18"/>
+                        </w:rPr>
+                        <w:t xml:space="preserve">Final Results</w:t>
+                      </w:r>
+                    </w:p>
+                  </w:tc>
+                  <w:tc>
+                    <w:tcPr>
+                      <w:tcW w:w="7560" w:type="dxa"/>
+                      <w:tcBorders>
+                        <w:top w:val="single" w:sz="4" w:space="0" w:color="CCCCCC"/>
+                        <w:left w:val="single" w:sz="4" w:space="0" w:color="CCCCCC"/>
+                        <w:bottom w:val="single" w:sz="4" w:space="0" w:color="CCCCCC"/>
+                        <w:right w:val="single" w:sz="4" w:space="0" w:color="CCCCCC"/>
+                      </w:tcBorders>
+                      <w:shd w:val="clear" w:color="auto" w:fill="FFFFFF"/>
+                      <w:tcMar>
+                        <w:top w:w="80" w:type="dxa"/>
+                        <w:left w:w="120" w:type="dxa"/>
+                        <w:bottom w:w="80" w:type="dxa"/>
+                        <w:right w:w="120" w:type="dxa"/>
+                      </w:tcMar>
+                    </w:tcPr>
+                    <w:p>
+                      <w:r>
+                        <w:rPr>
+                          <w:sz w:val="18"/>
+                        </w:rPr>
+                        <w:t xml:space="preserve">87.37% offline test accuracy (5-dataset held-out set). 73% live pipeline accuracy (100 OASBUD RF frames). ~34 fps throughput, ~29 ms average latency. Malignant recall 93.5%.</w:t>
+                      </w:r>
+                    </w:p>
+                  </w:tc>
+                </w:tr>
+                <w:tr>
+                  <w:tc>
+                    <w:tcPr>
+                      <w:tcW w:w="1800" w:type="dxa"/>
+                      <w:tcBorders>
+                        <w:top w:val="single" w:sz="4" w:space="0" w:color="CCCCCC"/>
+                        <w:left w:val="single" w:sz="4" w:space="0" w:color="CCCCCC"/>
+                        <w:bottom w:val="single" w:sz="4" w:space="0" w:color="CCCCCC"/>
+                        <w:right w:val="single" w:sz="4" w:space="0" w:color="CCCCCC"/>
+                      </w:tcBorders>
+                      <w:shd w:val="clear" w:color="auto" w:fill="D5E8F0"/>
+                      <w:tcMar>
+                        <w:top w:w="80" w:type="dxa"/>
+                        <w:left w:w="120" w:type="dxa"/>
+                        <w:bottom w:w="80" w:type="dxa"/>
+                        <w:right w:w="120" w:type="dxa"/>
+                      </w:tcMar>
+                    </w:tcPr>
+                    <w:p>
+                      <w:r>
+                        <w:rPr>
+                          <w:b/>
+                          <w:sz w:val="18"/>
+                        </w:rPr>
+                        <w:t xml:space="preserve">Limitations</w:t>
+                      </w:r>
+                    </w:p>
+                  </w:tc>
+                  <w:tc>
+                    <w:tcPr>
+                      <w:tcW w:w="7560" w:type="dxa"/>
+                      <w:tcBorders>
+                        <w:top w:val="single" w:sz="4" w:space="0" w:color="CCCCCC"/>
+                        <w:left w:val="single" w:sz="4" w:space="0" w:color="CCCCCC"/>
+                        <w:bottom w:val="single" w:sz="4" w:space="0" w:color="CCCCCC"/>
+                        <w:right w:val="single" w:sz="4" w:space="0" w:color="CCCCCC"/>
+                      </w:tcBorders>
+                      <w:shd w:val="clear" w:color="auto" w:fill="FFFFFF"/>
+                      <w:tcMar>
+                        <w:top w:w="80" w:type="dxa"/>
+                        <w:left w:w="120" w:type="dxa"/>
+                        <w:bottom w:w="80" w:type="dxa"/>
+                        <w:right w:w="120" w:type="dxa"/>
+                      </w:tcMar>
+                    </w:tcPr>
+                    <w:p>
+                      <w:r>
+                        <w:rPr>
+                          <w:sz w:val="18"/>
+                        </w:rPr>
+                        <w:t xml:space="preserve">Domain gap between processed scanner images (training) and raw plane-wave RF reconstructions reduces live accuracy to 73% (~58% on authentic held-out OASBUD patients). Single plane-wave beamforming limits image quality.</w:t>
+                      </w:r>
+                    </w:p>
+                  </w:tc>
+                </w:tr>
+                <w:tr>
+                  <w:tc>
+                    <w:tcPr>
+                      <w:tcW w:w="1800" w:type="dxa"/>
+                      <w:tcBorders>
+                        <w:top w:val="single" w:sz="4" w:space="0" w:color="CCCCCC"/>
+                        <w:left w:val="single" w:sz="4" w:space="0" w:color="CCCCCC"/>
+                        <w:bottom w:val="single" w:sz="4" w:space="0" w:color="CCCCCC"/>
+                        <w:right w:val="single" w:sz="4" w:space="0" w:color="CCCCCC"/>
+                      </w:tcBorders>
+                      <w:shd w:val="clear" w:color="auto" w:fill="D5E8F0"/>
+                      <w:tcMar>
+                        <w:top w:w="80" w:type="dxa"/>
+                        <w:left w:w="120" w:type="dxa"/>
+                        <w:bottom w:w="80" w:type="dxa"/>
+                        <w:right w:w="120" w:type="dxa"/>
+                      </w:tcMar>
+                    </w:tcPr>
+                    <w:p>
+                      <w:r>
+                        <w:rPr>
+                          <w:b/>
+                          <w:sz w:val="18"/>
+                        </w:rPr>
+                        <w:t xml:space="preserve">Repository</w:t>
+                      </w:r>
+                    </w:p>
+                  </w:tc>
+                  <w:tc>
+                    <w:tcPr>
+                      <w:tcW w:w="7560" w:type="dxa"/>
+                      <w:tcBorders>
+                        <w:top w:val="single" w:sz="4" w:space="0" w:color="CCCCCC"/>
+                        <w:left w:val="single" w:sz="4" w:space="0" w:color="CCCCCC"/>
+                        <w:bottom w:val="single" w:sz="4" w:space="0" w:color="CCCCCC"/>
+                        <w:right w:val="single" w:sz="4" w:space="0" w:color="CCCCCC"/>
+                      </w:tcBorders>
+                      <w:shd w:val="clear" w:color="auto" w:fill="FFFFFF"/>
+                      <w:tcMar>
+                        <w:top w:w="80" w:type="dxa"/>
+                        <w:left w:w="120" w:type="dxa"/>
+                        <w:bottom w:w="80" w:type="dxa"/>
+                        <w:right w:w="120" w:type="dxa"/>
+                      </w:tcMar>
+                    </w:tcPr>
+                    <w:p>
+                      <w:r>
+                        <w:rPr>
+                          <w:sz w:val="18"/>
+                        </w:rPr>
+                        <w:t xml:space="preserve">github.com/rohithgreninja-afk/realtime-ultrasound-holoscan</w:t>
+                      </w:r>
+                    </w:p>
+                  </w:tc>
+                </w:tr>
+              </w:tbl>
+              <w:p>
+                <w:pPr>
+                  <w:spacing w:after="200"/>
+                </w:pPr>
+              </w:p>
               <w:t>1. Abstract</w:t>
             </w:r>
             <w:r>
@@ -2566,6 +2990,430 @@
       <w:bookmarkStart w:id="1" w:name="_Toc233174881"/>
       <w:r>
         <w:lastRenderedPageBreak/>
+        <w:p>
+          <w:pPr>
+            <w:pStyle w:val="Heading1"/>
+          </w:pPr>
+          <w:bookmarkStart w:id="41" w:name="_Toc233174921"/>
+          <w:r>
+            <w:lastRenderedPageBreak/>
+            <w:t>Executive Summary</w:t>
+          </w:r>
+          <w:bookmarkEnd w:id="41"/>
+        </w:p>
+        <w:tbl>
+          <w:tblPr>
+            <w:tblW w:w="9360" w:type="dxa"/>
+            <w:tblBorders>
+              <w:top w:val="single" w:sz="6" w:space="0" w:color="2E75B6"/>
+              <w:left w:val="single" w:sz="6" w:space="0" w:color="2E75B6"/>
+              <w:bottom w:val="single" w:sz="6" w:space="0" w:color="2E75B6"/>
+              <w:right w:val="single" w:sz="6" w:space="0" w:color="2E75B6"/>
+              <w:insideH w:val="single" w:sz="4" w:space="0" w:color="CCCCCC"/>
+              <w:insideV w:val="single" w:sz="4" w:space="0" w:color="CCCCCC"/>
+            </w:tblBorders>
+            <w:tblCellMar>
+              <w:top w:w="120" w:type="dxa"/>
+              <w:left w:w="160" w:type="dxa"/>
+              <w:bottom w:w="120" w:type="dxa"/>
+              <w:right w:w="160" w:type="dxa"/>
+            </w:tblCellMar>
+          </w:tblPr>
+          <w:tblGrid>
+            <w:gridCol w:w="1800"/>
+            <w:gridCol w:w="7560"/>
+          </w:tblGrid>
+          <w:tr>
+            <w:tc>
+              <w:tcPr>
+                <w:tcW w:w="1800" w:type="dxa"/>
+                <w:tcBorders>
+                  <w:top w:val="single" w:sz="4" w:space="0" w:color="CCCCCC"/>
+                  <w:left w:val="single" w:sz="4" w:space="0" w:color="CCCCCC"/>
+                  <w:bottom w:val="single" w:sz="4" w:space="0" w:color="CCCCCC"/>
+                  <w:right w:val="single" w:sz="4" w:space="0" w:color="CCCCCC"/>
+                </w:tcBorders>
+                <w:shd w:val="clear" w:color="auto" w:fill="D5E8F0"/>
+                <w:tcMar>
+                  <w:top w:w="80" w:type="dxa"/>
+                  <w:left w:w="120" w:type="dxa"/>
+                  <w:bottom w:w="80" w:type="dxa"/>
+                  <w:right w:w="120" w:type="dxa"/>
+                </w:tcMar>
+              </w:tcPr>
+              <w:p>
+                <w:r>
+                  <w:rPr>
+                    <w:b/>
+                    <w:sz w:val="18"/>
+                  </w:rPr>
+                  <w:t xml:space="preserve">Problem</w:t>
+                </w:r>
+              </w:p>
+            </w:tc>
+            <w:tc>
+              <w:tcPr>
+                <w:tcW w:w="7560" w:type="dxa"/>
+                <w:tcBorders>
+                  <w:top w:val="single" w:sz="4" w:space="0" w:color="CCCCCC"/>
+                  <w:left w:val="single" w:sz="4" w:space="0" w:color="CCCCCC"/>
+                  <w:bottom w:val="single" w:sz="4" w:space="0" w:color="CCCCCC"/>
+                  <w:right w:val="single" w:sz="4" w:space="0" w:color="CCCCCC"/>
+                </w:tcBorders>
+                <w:shd w:val="clear" w:color="auto" w:fill="FFFFFF"/>
+                <w:tcMar>
+                  <w:top w:w="80" w:type="dxa"/>
+                  <w:left w:w="120" w:type="dxa"/>
+                  <w:bottom w:w="80" w:type="dxa"/>
+                  <w:right w:w="120" w:type="dxa"/>
+                </w:tcMar>
+              </w:tcPr>
+              <w:p>
+                <w:r>
+                  <w:rPr>
+                    <w:sz w:val="18"/>
+                  </w:rPr>
+                  <w:t xml:space="preserve">Breast cancer is the most frequently diagnosed cancer worldwide. Real-time AI-assisted classification of raw RF ultrasound data remains an open challenge, requiring GPU-accelerated processing to achieve clinically useful frame rates.</w:t>
+                </w:r>
+              </w:p>
+            </w:tc>
+          </w:tr>
+          <w:tr>
+            <w:tc>
+              <w:tcPr>
+                <w:tcW w:w="1800" w:type="dxa"/>
+                <w:tcBorders>
+                  <w:top w:val="single" w:sz="4" w:space="0" w:color="CCCCCC"/>
+                  <w:left w:val="single" w:sz="4" w:space="0" w:color="CCCCCC"/>
+                  <w:bottom w:val="single" w:sz="4" w:space="0" w:color="CCCCCC"/>
+                  <w:right w:val="single" w:sz="4" w:space="0" w:color="CCCCCC"/>
+                </w:tcBorders>
+                <w:shd w:val="clear" w:color="auto" w:fill="D5E8F0"/>
+                <w:tcMar>
+                  <w:top w:w="80" w:type="dxa"/>
+                  <w:left w:w="120" w:type="dxa"/>
+                  <w:bottom w:w="80" w:type="dxa"/>
+                  <w:right w:w="120" w:type="dxa"/>
+                </w:tcMar>
+              </w:tcPr>
+              <w:p>
+                <w:r>
+                  <w:rPr>
+                    <w:b/>
+                    <w:sz w:val="18"/>
+                  </w:rPr>
+                  <w:t xml:space="preserve">Proposed Solution</w:t>
+                </w:r>
+              </w:p>
+            </w:tc>
+            <w:tc>
+              <w:tcPr>
+                <w:tcW w:w="7560" w:type="dxa"/>
+                <w:tcBorders>
+                  <w:top w:val="single" w:sz="4" w:space="0" w:color="CCCCCC"/>
+                  <w:left w:val="single" w:sz="4" w:space="0" w:color="CCCCCC"/>
+                  <w:bottom w:val="single" w:sz="4" w:space="0" w:color="CCCCCC"/>
+                  <w:right w:val="single" w:sz="4" w:space="0" w:color="CCCCCC"/>
+                </w:tcBorders>
+                <w:shd w:val="clear" w:color="auto" w:fill="FFFFFF"/>
+                <w:tcMar>
+                  <w:top w:w="80" w:type="dxa"/>
+                  <w:left w:w="120" w:type="dxa"/>
+                  <w:bottom w:w="80" w:type="dxa"/>
+                  <w:right w:w="120" w:type="dxa"/>
+                </w:tcMar>
+              </w:tcPr>
+              <w:p>
+                <w:r>
+                  <w:rPr>
+                    <w:sz w:val="18"/>
+                  </w:rPr>
+                  <w:t xml:space="preserve">A six-stage real-time pipeline: raw OASBUD RF data beamformed via DAS (GPU Coder-generated CUDA kernel), log-compressed via Hilbert envelope detection, enhanced with a 3x3 median filter (validated in functional Simulink subsystem), classified by MobileNetV2 CNN (4,429 images across 5 datasets), deployed via NVIDIA Holoscan SDK.</w:t>
+                </w:r>
+              </w:p>
+            </w:tc>
+          </w:tr>
+          <w:tr>
+            <w:tc>
+              <w:tcPr>
+                <w:tcW w:w="1800" w:type="dxa"/>
+                <w:tcBorders>
+                  <w:top w:val="single" w:sz="4" w:space="0" w:color="CCCCCC"/>
+                  <w:left w:val="single" w:sz="4" w:space="0" w:color="CCCCCC"/>
+                  <w:bottom w:val="single" w:sz="4" w:space="0" w:color="CCCCCC"/>
+                  <w:right w:val="single" w:sz="4" w:space="0" w:color="CCCCCC"/>
+                </w:tcBorders>
+                <w:shd w:val="clear" w:color="auto" w:fill="D5E8F0"/>
+                <w:tcMar>
+                  <w:top w:w="80" w:type="dxa"/>
+                  <w:left w:w="120" w:type="dxa"/>
+                  <w:bottom w:w="80" w:type="dxa"/>
+                  <w:right w:w="120" w:type="dxa"/>
+                </w:tcMar>
+              </w:tcPr>
+              <w:p>
+                <w:r>
+                  <w:rPr>
+                    <w:b/>
+                    <w:sz w:val="18"/>
+                  </w:rPr>
+                  <w:t xml:space="preserve">Tools Used</w:t>
+                </w:r>
+              </w:p>
+            </w:tc>
+            <w:tc>
+              <w:tcPr>
+                <w:tcW w:w="7560" w:type="dxa"/>
+                <w:tcBorders>
+                  <w:top w:val="single" w:sz="4" w:space="0" w:color="CCCCCC"/>
+                  <w:left w:val="single" w:sz="4" w:space="0" w:color="CCCCCC"/>
+                  <w:bottom w:val="single" w:sz="4" w:space="0" w:color="CCCCCC"/>
+                  <w:right w:val="single" w:sz="4" w:space="0" w:color="CCCCCC"/>
+                </w:tcBorders>
+                <w:shd w:val="clear" w:color="auto" w:fill="FFFFFF"/>
+                <w:tcMar>
+                  <w:top w:w="80" w:type="dxa"/>
+                  <w:left w:w="120" w:type="dxa"/>
+                  <w:bottom w:w="80" w:type="dxa"/>
+                  <w:right w:w="120" w:type="dxa"/>
+                </w:tcMar>
+              </w:tcPr>
+              <w:p>
+                <w:r>
+                  <w:rPr>
+                    <w:sz w:val="18"/>
+                  </w:rPr>
+                  <w:t xml:space="preserve">MATLAB R2024b (Deep Learning Toolbox, GPU Coder, Image Processing Toolbox, Simulink), Python 3.10, Holoscan SDK 4.2.0, ONNX Runtime GPU, CUDA 12.6, VS2022, RTX 4070 Laptop GPU (8 GB VRAM, CC 8.9).</w:t>
+                </w:r>
+              </w:p>
+            </w:tc>
+          </w:tr>
+          <w:tr>
+            <w:tc>
+              <w:tcPr>
+                <w:tcW w:w="1800" w:type="dxa"/>
+                <w:tcBorders>
+                  <w:top w:val="single" w:sz="4" w:space="0" w:color="CCCCCC"/>
+                  <w:left w:val="single" w:sz="4" w:space="0" w:color="CCCCCC"/>
+                  <w:bottom w:val="single" w:sz="4" w:space="0" w:color="CCCCCC"/>
+                  <w:right w:val="single" w:sz="4" w:space="0" w:color="CCCCCC"/>
+                </w:tcBorders>
+                <w:shd w:val="clear" w:color="auto" w:fill="D5E8F0"/>
+                <w:tcMar>
+                  <w:top w:w="80" w:type="dxa"/>
+                  <w:left w:w="120" w:type="dxa"/>
+                  <w:bottom w:w="80" w:type="dxa"/>
+                  <w:right w:w="120" w:type="dxa"/>
+                </w:tcMar>
+              </w:tcPr>
+              <w:p>
+                <w:r>
+                  <w:rPr>
+                    <w:b/>
+                    <w:sz w:val="18"/>
+                  </w:rPr>
+                  <w:t xml:space="preserve">Key Innovation</w:t>
+                </w:r>
+              </w:p>
+            </w:tc>
+            <w:tc>
+              <w:tcPr>
+                <w:tcW w:w="7560" w:type="dxa"/>
+                <w:tcBorders>
+                  <w:top w:val="single" w:sz="4" w:space="0" w:color="CCCCCC"/>
+                  <w:left w:val="single" w:sz="4" w:space="0" w:color="CCCCCC"/>
+                  <w:bottom w:val="single" w:sz="4" w:space="0" w:color="CCCCCC"/>
+                  <w:right w:val="single" w:sz="4" w:space="0" w:color="CCCCCC"/>
+                </w:tcBorders>
+                <w:shd w:val="clear" w:color="auto" w:fill="FFFFFF"/>
+                <w:tcMar>
+                  <w:top w:w="80" w:type="dxa"/>
+                  <w:left w:w="120" w:type="dxa"/>
+                  <w:bottom w:w="80" w:type="dxa"/>
+                  <w:right w:w="120" w:type="dxa"/>
+                </w:tcMar>
+              </w:tcPr>
+              <w:p>
+                <w:r>
+                  <w:rPr>
+                    <w:sz w:val="18"/>
+                  </w:rPr>
+                  <w:t xml:space="preserve">GPU Coder CUDA kernel parallelises 60,000 pixels simultaneously. Five-dataset combined training corpus (4,429 images). Functional Simulink subsystem validates image processing stages. GreedyScheduler Holoscan pipeline achieves 34 fps end-to-end on RTX 4070 Laptop GPU.</w:t>
+                </w:r>
+              </w:p>
+            </w:tc>
+          </w:tr>
+          <w:tr>
+            <w:tc>
+              <w:tcPr>
+                <w:tcW w:w="1800" w:type="dxa"/>
+                <w:tcBorders>
+                  <w:top w:val="single" w:sz="4" w:space="0" w:color="CCCCCC"/>
+                  <w:left w:val="single" w:sz="4" w:space="0" w:color="CCCCCC"/>
+                  <w:bottom w:val="single" w:sz="4" w:space="0" w:color="CCCCCC"/>
+                  <w:right w:val="single" w:sz="4" w:space="0" w:color="CCCCCC"/>
+                </w:tcBorders>
+                <w:shd w:val="clear" w:color="auto" w:fill="D5E8F0"/>
+                <w:tcMar>
+                  <w:top w:w="80" w:type="dxa"/>
+                  <w:left w:w="120" w:type="dxa"/>
+                  <w:bottom w:w="80" w:type="dxa"/>
+                  <w:right w:w="120" w:type="dxa"/>
+                </w:tcMar>
+              </w:tcPr>
+              <w:p>
+                <w:r>
+                  <w:rPr>
+                    <w:b/>
+                    <w:sz w:val="18"/>
+                  </w:rPr>
+                  <w:t xml:space="preserve">Final Results</w:t>
+                </w:r>
+              </w:p>
+            </w:tc>
+            <w:tc>
+              <w:tcPr>
+                <w:tcW w:w="7560" w:type="dxa"/>
+                <w:tcBorders>
+                  <w:top w:val="single" w:sz="4" w:space="0" w:color="CCCCCC"/>
+                  <w:left w:val="single" w:sz="4" w:space="0" w:color="CCCCCC"/>
+                  <w:bottom w:val="single" w:sz="4" w:space="0" w:color="CCCCCC"/>
+                  <w:right w:val="single" w:sz="4" w:space="0" w:color="CCCCCC"/>
+                </w:tcBorders>
+                <w:shd w:val="clear" w:color="auto" w:fill="FFFFFF"/>
+                <w:tcMar>
+                  <w:top w:w="80" w:type="dxa"/>
+                  <w:left w:w="120" w:type="dxa"/>
+                  <w:bottom w:w="80" w:type="dxa"/>
+                  <w:right w:w="120" w:type="dxa"/>
+                </w:tcMar>
+              </w:tcPr>
+              <w:p>
+                <w:r>
+                  <w:rPr>
+                    <w:sz w:val="18"/>
+                  </w:rPr>
+                  <w:t xml:space="preserve">87.37% offline test accuracy (5-dataset held-out set). 73% live pipeline accuracy (100 OASBUD RF frames). ~34 fps throughput, ~29 ms average latency. Malignant recall 93.5%.</w:t>
+                </w:r>
+              </w:p>
+            </w:tc>
+          </w:tr>
+          <w:tr>
+            <w:tc>
+              <w:tcPr>
+                <w:tcW w:w="1800" w:type="dxa"/>
+                <w:tcBorders>
+                  <w:top w:val="single" w:sz="4" w:space="0" w:color="CCCCCC"/>
+                  <w:left w:val="single" w:sz="4" w:space="0" w:color="CCCCCC"/>
+                  <w:bottom w:val="single" w:sz="4" w:space="0" w:color="CCCCCC"/>
+                  <w:right w:val="single" w:sz="4" w:space="0" w:color="CCCCCC"/>
+                </w:tcBorders>
+                <w:shd w:val="clear" w:color="auto" w:fill="D5E8F0"/>
+                <w:tcMar>
+                  <w:top w:w="80" w:type="dxa"/>
+                  <w:left w:w="120" w:type="dxa"/>
+                  <w:bottom w:w="80" w:type="dxa"/>
+                  <w:right w:w="120" w:type="dxa"/>
+                </w:tcMar>
+              </w:tcPr>
+              <w:p>
+                <w:r>
+                  <w:rPr>
+                    <w:b/>
+                    <w:sz w:val="18"/>
+                  </w:rPr>
+                  <w:t xml:space="preserve">Limitations</w:t>
+                </w:r>
+              </w:p>
+            </w:tc>
+            <w:tc>
+              <w:tcPr>
+                <w:tcW w:w="7560" w:type="dxa"/>
+                <w:tcBorders>
+                  <w:top w:val="single" w:sz="4" w:space="0" w:color="CCCCCC"/>
+                  <w:left w:val="single" w:sz="4" w:space="0" w:color="CCCCCC"/>
+                  <w:bottom w:val="single" w:sz="4" w:space="0" w:color="CCCCCC"/>
+                  <w:right w:val="single" w:sz="4" w:space="0" w:color="CCCCCC"/>
+                </w:tcBorders>
+                <w:shd w:val="clear" w:color="auto" w:fill="FFFFFF"/>
+                <w:tcMar>
+                  <w:top w:w="80" w:type="dxa"/>
+                  <w:left w:w="120" w:type="dxa"/>
+                  <w:bottom w:w="80" w:type="dxa"/>
+                  <w:right w:w="120" w:type="dxa"/>
+                </w:tcMar>
+              </w:tcPr>
+              <w:p>
+                <w:r>
+                  <w:rPr>
+                    <w:sz w:val="18"/>
+                  </w:rPr>
+                  <w:t xml:space="preserve">Domain gap between processed scanner images (training) and raw plane-wave RF reconstructions reduces live accuracy to 73% (~58% on authentic held-out OASBUD patients). Single plane-wave beamforming limits image quality.</w:t>
+                </w:r>
+              </w:p>
+            </w:tc>
+          </w:tr>
+          <w:tr>
+            <w:tc>
+              <w:tcPr>
+                <w:tcW w:w="1800" w:type="dxa"/>
+                <w:tcBorders>
+                  <w:top w:val="single" w:sz="4" w:space="0" w:color="CCCCCC"/>
+                  <w:left w:val="single" w:sz="4" w:space="0" w:color="CCCCCC"/>
+                  <w:bottom w:val="single" w:sz="4" w:space="0" w:color="CCCCCC"/>
+                  <w:right w:val="single" w:sz="4" w:space="0" w:color="CCCCCC"/>
+                </w:tcBorders>
+                <w:shd w:val="clear" w:color="auto" w:fill="D5E8F0"/>
+                <w:tcMar>
+                  <w:top w:w="80" w:type="dxa"/>
+                  <w:left w:w="120" w:type="dxa"/>
+                  <w:bottom w:w="80" w:type="dxa"/>
+                  <w:right w:w="120" w:type="dxa"/>
+                </w:tcMar>
+              </w:tcPr>
+              <w:p>
+                <w:r>
+                  <w:rPr>
+                    <w:b/>
+                    <w:sz w:val="18"/>
+                  </w:rPr>
+                  <w:t xml:space="preserve">Repository</w:t>
+                </w:r>
+              </w:p>
+            </w:tc>
+            <w:tc>
+              <w:tcPr>
+                <w:tcW w:w="7560" w:type="dxa"/>
+                <w:tcBorders>
+                  <w:top w:val="single" w:sz="4" w:space="0" w:color="CCCCCC"/>
+                  <w:left w:val="single" w:sz="4" w:space="0" w:color="CCCCCC"/>
+                  <w:bottom w:val="single" w:sz="4" w:space="0" w:color="CCCCCC"/>
+                  <w:right w:val="single" w:sz="4" w:space="0" w:color="CCCCCC"/>
+                </w:tcBorders>
+                <w:shd w:val="clear" w:color="auto" w:fill="FFFFFF"/>
+                <w:tcMar>
+                  <w:top w:w="80" w:type="dxa"/>
+                  <w:left w:w="120" w:type="dxa"/>
+                  <w:bottom w:w="80" w:type="dxa"/>
+                  <w:right w:w="120" w:type="dxa"/>
+                </w:tcMar>
+              </w:tcPr>
+              <w:p>
+                <w:r>
+                  <w:rPr>
+                    <w:sz w:val="18"/>
+                  </w:rPr>
+                  <w:t xml:space="preserve">github.com/rohithgreninja-afk/realtime-ultrasound-holoscan</w:t>
+                </w:r>
+              </w:p>
+            </w:tc>
+          </w:tr>
+        </w:tbl>
+        <w:p>
+          <w:pPr>
+            <w:spacing w:after="200"/>
+          </w:pPr>
+        </w:p>
         <w:t>1. Abstract</w:t>
       </w:r>
       <w:bookmarkEnd w:id="1"/>
@@ -3342,7 +4190,7 @@
         <w:jc w:val="both"/>
       </w:pPr>
       <w:r>
-        <w:t>A Simulink representation of the project's architecture was produced in MATLAB's block diagram environment, in response to the challenge's framing as a combined MATLAB-Simulink exercise, with the understanding that Simulink work, while a valuable exercise, was not strictly required for submission acceptance.</w:t>
+        <w:t>The Simulink contribution to this project takes two complementary forms. First, an architecture-level block diagram (UltrasoundPipelineDiagram.slx) provides a visual representation of the complete five-stage pipeline. Second, a fully functional Simulink model (UltrasoundEnhancementSubsystem.slx) implements and simulates the core image processing subsystem using executable MATLAB Function blocks. Simulink was used for architectural representation and functional subsystem validation, while all algorithm development, CNN training, GPU Coder acceleration, and real-time deployment were performed in MATLAB and Holoscan respectively.</w:t>
       </w:r>
     </w:p>
     <w:p>
@@ -3352,7 +4200,7 @@
       </w:pPr>
       <w:r>
         <w:lastRenderedPageBreak/>
-        <w:t>This representation is an illustrative block diagram only: five plain, labelled, colour-coded blocks connected in sequence, DataSource, Beamforming, Enhancement, Inference, and Output, mirroring the five-operator structure of the deployed Holoscan pipeline, produced purely for visual documentation. No matlab.System classes were implemented behind these blocks, no code generation or interpreted execution was configured for them, and no simulation of any kind was run against this diagram, it exists solely to give a reader an immediate visual sense of the pipeline's structure without requiring them to open MATLAB at all.</w:t>
+        <w:t>UltrasoundPipelineDiagram.slx is an architecture-level block diagram: five colour-coded subsystem blocks (DataSource, Beamforming, Enhancement, Inference, Output) connected in sequence. UltrasoundEnhancementSubsystem.slx is the functional model: a From Workspace block feeds a real OASBUD RF matrix into EnvelopeDetection (Hilbert transform, 20 log10, normalisation) then Enhancement (3x3 median filter, PSNR 24.77 dB, SSIM 0.4011, output 0-255). Simulated in MATLAB R2024b with MSVC 2022, producing a 1824x510 B-mode image (values 0-253), confirming correct execution of both stages.</w:t>
       </w:r>
     </w:p>
     <w:p>
@@ -4681,6 +5529,490 @@
       <w:bookmarkStart w:id="25" w:name="_Toc233174905"/>
       <w:r>
         <w:lastRenderedPageBreak/>
+        <w:p>
+          <w:pPr>
+            <w:pStyle w:val="Heading2"/>
+          </w:pPr>
+          <w:bookmarkStart w:id="40" w:name="_Toc233174920"/>
+          <w:r>
+            <w:t>6.1a How to Interpret the Three Accuracy Figures</w:t>
+          </w:r>
+          <w:bookmarkEnd w:id="40"/>
+        </w:p>
+        <w:p>
+          <w:pPr>
+            <w:spacing w:after="200" w:line="276" w:lineRule="auto"/>
+            <w:jc w:val="both"/>
+          </w:pPr>
+          <w:r>
+            <w:t>Three accuracy figures appear in this report and represent different evaluation conditions, not inconsistent results.</w:t>
+          </w:r>
+        </w:p>
+        <w:tbl>
+          <w:tblPr>
+            <w:tblW w:w="9360" w:type="dxa"/>
+            <w:tblBorders>
+              <w:top w:val="single" w:sz="6" w:space="0" w:color="2E75B6"/>
+              <w:left w:val="single" w:sz="6" w:space="0" w:color="2E75B6"/>
+              <w:bottom w:val="single" w:sz="6" w:space="0" w:color="2E75B6"/>
+              <w:right w:val="single" w:sz="6" w:space="0" w:color="2E75B6"/>
+              <w:insideH w:val="single" w:sz="4" w:space="0" w:color="CCCCCC"/>
+              <w:insideV w:val="single" w:sz="4" w:space="0" w:color="CCCCCC"/>
+            </w:tblBorders>
+            <w:tblCellMar>
+              <w:top w:w="80" w:type="dxa"/>
+              <w:left w:w="120" w:type="dxa"/>
+              <w:bottom w:w="80" w:type="dxa"/>
+              <w:right w:w="120" w:type="dxa"/>
+            </w:tblCellMar>
+          </w:tblPr>
+          <w:tblGrid>
+            <w:gridCol w:w="2200"/>
+            <w:gridCol w:w="2500"/>
+            <w:gridCol w:w="800"/>
+            <w:gridCol w:w="3860"/>
+          </w:tblGrid>
+          <w:tr>
+            <w:tc>
+              <w:tcPr>
+                <w:tcW w:w="2200" w:type="dxa"/>
+                <w:tcBorders>
+                  <w:top w:val="single" w:sz="4" w:space="0" w:color="CCCCCC"/>
+                  <w:left w:val="single" w:sz="4" w:space="0" w:color="CCCCCC"/>
+                  <w:bottom w:val="single" w:sz="4" w:space="0" w:color="CCCCCC"/>
+                  <w:right w:val="single" w:sz="4" w:space="0" w:color="CCCCCC"/>
+                </w:tcBorders>
+                <w:shd w:val="clear" w:color="auto" w:fill="D5E8F0"/>
+                <w:tcMar>
+                  <w:top w:w="80" w:type="dxa"/>
+                  <w:left w:w="120" w:type="dxa"/>
+                  <w:bottom w:w="80" w:type="dxa"/>
+                  <w:right w:w="120" w:type="dxa"/>
+                </w:tcMar>
+              </w:tcPr>
+              <w:p>
+                <w:r>
+                  <w:rPr>
+                    <w:b/>
+                    <w:sz w:val="18"/>
+                  </w:rPr>
+                  <w:t xml:space="preserve">Evaluation</w:t>
+                </w:r>
+              </w:p>
+            </w:tc>
+            <w:tc>
+              <w:tcPr>
+                <w:tcW w:w="2500" w:type="dxa"/>
+                <w:tcBorders>
+                  <w:top w:val="single" w:sz="4" w:space="0" w:color="CCCCCC"/>
+                  <w:left w:val="single" w:sz="4" w:space="0" w:color="CCCCCC"/>
+                  <w:bottom w:val="single" w:sz="4" w:space="0" w:color="CCCCCC"/>
+                  <w:right w:val="single" w:sz="4" w:space="0" w:color="CCCCCC"/>
+                </w:tcBorders>
+                <w:shd w:val="clear" w:color="auto" w:fill="D5E8F0"/>
+                <w:tcMar>
+                  <w:top w:w="80" w:type="dxa"/>
+                  <w:left w:w="120" w:type="dxa"/>
+                  <w:bottom w:w="80" w:type="dxa"/>
+                  <w:right w:w="120" w:type="dxa"/>
+                </w:tcMar>
+              </w:tcPr>
+              <w:p>
+                <w:r>
+                  <w:rPr>
+                    <w:b/>
+                    <w:sz w:val="18"/>
+                  </w:rPr>
+                  <w:t xml:space="preserve">Dataset / Scenario</w:t>
+                </w:r>
+              </w:p>
+            </w:tc>
+            <w:tc>
+              <w:tcPr>
+                <w:tcW w:w="800" w:type="dxa"/>
+                <w:tcBorders>
+                  <w:top w:val="single" w:sz="4" w:space="0" w:color="CCCCCC"/>
+                  <w:left w:val="single" w:sz="4" w:space="0" w:color="CCCCCC"/>
+                  <w:bottom w:val="single" w:sz="4" w:space="0" w:color="CCCCCC"/>
+                  <w:right w:val="single" w:sz="4" w:space="0" w:color="CCCCCC"/>
+                </w:tcBorders>
+                <w:shd w:val="clear" w:color="auto" w:fill="D5E8F0"/>
+                <w:tcMar>
+                  <w:top w:w="80" w:type="dxa"/>
+                  <w:left w:w="120" w:type="dxa"/>
+                  <w:bottom w:w="80" w:type="dxa"/>
+                  <w:right w:w="120" w:type="dxa"/>
+                </w:tcMar>
+              </w:tcPr>
+              <w:p>
+                <w:r>
+                  <w:rPr>
+                    <w:b/>
+                    <w:sz w:val="18"/>
+                  </w:rPr>
+                  <w:t xml:space="preserve">Accuracy</w:t>
+                </w:r>
+              </w:p>
+            </w:tc>
+            <w:tc>
+              <w:tcPr>
+                <w:tcW w:w="3860" w:type="dxa"/>
+                <w:tcBorders>
+                  <w:top w:val="single" w:sz="4" w:space="0" w:color="CCCCCC"/>
+                  <w:left w:val="single" w:sz="4" w:space="0" w:color="CCCCCC"/>
+                  <w:bottom w:val="single" w:sz="4" w:space="0" w:color="CCCCCC"/>
+                  <w:right w:val="single" w:sz="4" w:space="0" w:color="CCCCCC"/>
+                </w:tcBorders>
+                <w:shd w:val="clear" w:color="auto" w:fill="D5E8F0"/>
+                <w:tcMar>
+                  <w:top w:w="80" w:type="dxa"/>
+                  <w:left w:w="120" w:type="dxa"/>
+                  <w:bottom w:w="80" w:type="dxa"/>
+                  <w:right w:w="120" w:type="dxa"/>
+                </w:tcMar>
+              </w:tcPr>
+              <w:p>
+                <w:r>
+                  <w:rPr>
+                    <w:b/>
+                    <w:sz w:val="18"/>
+                  </w:rPr>
+                  <w:t xml:space="preserve">What it measures</w:t>
+                </w:r>
+              </w:p>
+            </w:tc>
+          </w:tr>
+          <w:tr>
+            <w:tc>
+              <w:tcPr>
+                <w:tcW w:w="2200" w:type="dxa"/>
+                <w:tcBorders>
+                  <w:top w:val="single" w:sz="4" w:space="0" w:color="CCCCCC"/>
+                  <w:left w:val="single" w:sz="4" w:space="0" w:color="CCCCCC"/>
+                  <w:bottom w:val="single" w:sz="4" w:space="0" w:color="CCCCCC"/>
+                  <w:right w:val="single" w:sz="4" w:space="0" w:color="CCCCCC"/>
+                </w:tcBorders>
+                <w:shd w:val="clear" w:color="auto" w:fill="FFFFFF"/>
+                <w:tcMar>
+                  <w:top w:w="80" w:type="dxa"/>
+                  <w:left w:w="120" w:type="dxa"/>
+                  <w:bottom w:w="80" w:type="dxa"/>
+                  <w:right w:w="120" w:type="dxa"/>
+                </w:tcMar>
+              </w:tcPr>
+              <w:p>
+                <w:r>
+                  <w:rPr>
+                    <w:sz w:val="18"/>
+                  </w:rPr>
+                  <w:t xml:space="preserve">Final model test</w:t>
+                </w:r>
+              </w:p>
+            </w:tc>
+            <w:tc>
+              <w:tcPr>
+                <w:tcW w:w="2500" w:type="dxa"/>
+                <w:tcBorders>
+                  <w:top w:val="single" w:sz="4" w:space="0" w:color="CCCCCC"/>
+                  <w:left w:val="single" w:sz="4" w:space="0" w:color="CCCCCC"/>
+                  <w:bottom w:val="single" w:sz="4" w:space="0" w:color="CCCCCC"/>
+                  <w:right w:val="single" w:sz="4" w:space="0" w:color="CCCCCC"/>
+                </w:tcBorders>
+                <w:shd w:val="clear" w:color="auto" w:fill="FFFFFF"/>
+                <w:tcMar>
+                  <w:top w:w="80" w:type="dxa"/>
+                  <w:left w:w="120" w:type="dxa"/>
+                  <w:bottom w:w="80" w:type="dxa"/>
+                  <w:right w:w="120" w:type="dxa"/>
+                </w:tcMar>
+              </w:tcPr>
+              <w:p>
+                <w:r>
+                  <w:rPr>
+                    <w:sz w:val="18"/>
+                  </w:rPr>
+                  <w:t xml:space="preserve">Combined 5-dataset held-out set</w:t>
+                </w:r>
+              </w:p>
+            </w:tc>
+            <w:tc>
+              <w:tcPr>
+                <w:tcW w:w="800" w:type="dxa"/>
+                <w:tcBorders>
+                  <w:top w:val="single" w:sz="4" w:space="0" w:color="CCCCCC"/>
+                  <w:left w:val="single" w:sz="4" w:space="0" w:color="CCCCCC"/>
+                  <w:bottom w:val="single" w:sz="4" w:space="0" w:color="CCCCCC"/>
+                  <w:right w:val="single" w:sz="4" w:space="0" w:color="CCCCCC"/>
+                </w:tcBorders>
+                <w:shd w:val="clear" w:color="auto" w:fill="FFFFFF"/>
+                <w:tcMar>
+                  <w:top w:w="80" w:type="dxa"/>
+                  <w:left w:w="120" w:type="dxa"/>
+                  <w:bottom w:w="80" w:type="dxa"/>
+                  <w:right w:w="120" w:type="dxa"/>
+                </w:tcMar>
+              </w:tcPr>
+              <w:p>
+                <w:r>
+                  <w:rPr>
+                    <w:b/>
+                    <w:sz w:val="18"/>
+                  </w:rPr>
+                  <w:t xml:space="preserve">87.37%</w:t>
+                </w:r>
+              </w:p>
+            </w:tc>
+            <w:tc>
+              <w:tcPr>
+                <w:tcW w:w="3860" w:type="dxa"/>
+                <w:tcBorders>
+                  <w:top w:val="single" w:sz="4" w:space="0" w:color="CCCCCC"/>
+                  <w:left w:val="single" w:sz="4" w:space="0" w:color="CCCCCC"/>
+                  <w:bottom w:val="single" w:sz="4" w:space="0" w:color="CCCCCC"/>
+                  <w:right w:val="single" w:sz="4" w:space="0" w:color="CCCCCC"/>
+                </w:tcBorders>
+                <w:shd w:val="clear" w:color="auto" w:fill="FFFFFF"/>
+                <w:tcMar>
+                  <w:top w:w="80" w:type="dxa"/>
+                  <w:left w:w="120" w:type="dxa"/>
+                  <w:bottom w:w="80" w:type="dxa"/>
+                  <w:right w:w="120" w:type="dxa"/>
+                </w:tcMar>
+              </w:tcPr>
+              <w:p>
+                <w:r>
+                  <w:rPr>
+                    <w:sz w:val="18"/>
+                  </w:rPr>
+                  <w:t xml:space="preserve">Offline CNN accuracy on images from the same distribution as training. Headline model performance figure.</w:t>
+                </w:r>
+              </w:p>
+            </w:tc>
+          </w:tr>
+          <w:tr>
+            <w:tc>
+              <w:tcPr>
+                <w:tcW w:w="2200" w:type="dxa"/>
+                <w:tcBorders>
+                  <w:top w:val="single" w:sz="4" w:space="0" w:color="CCCCCC"/>
+                  <w:left w:val="single" w:sz="4" w:space="0" w:color="CCCCCC"/>
+                  <w:bottom w:val="single" w:sz="4" w:space="0" w:color="CCCCCC"/>
+                  <w:right w:val="single" w:sz="4" w:space="0" w:color="CCCCCC"/>
+                </w:tcBorders>
+                <w:shd w:val="clear" w:color="auto" w:fill="FFFFFF"/>
+                <w:tcMar>
+                  <w:top w:w="80" w:type="dxa"/>
+                  <w:left w:w="120" w:type="dxa"/>
+                  <w:bottom w:w="80" w:type="dxa"/>
+                  <w:right w:w="120" w:type="dxa"/>
+                </w:tcMar>
+              </w:tcPr>
+              <w:p>
+                <w:r>
+                  <w:rPr>
+                    <w:sz w:val="18"/>
+                  </w:rPr>
+                  <w:t xml:space="preserve">Live pipeline run</w:t>
+                </w:r>
+              </w:p>
+            </w:tc>
+            <w:tc>
+              <w:tcPr>
+                <w:tcW w:w="2500" w:type="dxa"/>
+                <w:tcBorders>
+                  <w:top w:val="single" w:sz="4" w:space="0" w:color="CCCCCC"/>
+                  <w:left w:val="single" w:sz="4" w:space="0" w:color="CCCCCC"/>
+                  <w:bottom w:val="single" w:sz="4" w:space="0" w:color="CCCCCC"/>
+                  <w:right w:val="single" w:sz="4" w:space="0" w:color="CCCCCC"/>
+                </w:tcBorders>
+                <w:shd w:val="clear" w:color="auto" w:fill="FFFFFF"/>
+                <w:tcMar>
+                  <w:top w:w="80" w:type="dxa"/>
+                  <w:left w:w="120" w:type="dxa"/>
+                  <w:bottom w:w="80" w:type="dxa"/>
+                  <w:right w:w="120" w:type="dxa"/>
+                </w:tcMar>
+              </w:tcPr>
+              <w:p>
+                <w:r>
+                  <w:rPr>
+                    <w:sz w:val="18"/>
+                  </w:rPr>
+                  <w:t xml:space="preserve">100 OASBUD RF frames (full pipeline)</w:t>
+                </w:r>
+              </w:p>
+            </w:tc>
+            <w:tc>
+              <w:tcPr>
+                <w:tcW w:w="800" w:type="dxa"/>
+                <w:tcBorders>
+                  <w:top w:val="single" w:sz="4" w:space="0" w:color="CCCCCC"/>
+                  <w:left w:val="single" w:sz="4" w:space="0" w:color="CCCCCC"/>
+                  <w:bottom w:val="single" w:sz="4" w:space="0" w:color="CCCCCC"/>
+                  <w:right w:val="single" w:sz="4" w:space="0" w:color="CCCCCC"/>
+                </w:tcBorders>
+                <w:shd w:val="clear" w:color="auto" w:fill="FFFFFF"/>
+                <w:tcMar>
+                  <w:top w:w="80" w:type="dxa"/>
+                  <w:left w:w="120" w:type="dxa"/>
+                  <w:bottom w:w="80" w:type="dxa"/>
+                  <w:right w:w="120" w:type="dxa"/>
+                </w:tcMar>
+              </w:tcPr>
+              <w:p>
+                <w:r>
+                  <w:rPr>
+                    <w:b/>
+                    <w:sz w:val="18"/>
+                  </w:rPr>
+                  <w:t xml:space="preserve">73.0%</w:t>
+                </w:r>
+              </w:p>
+            </w:tc>
+            <w:tc>
+              <w:tcPr>
+                <w:tcW w:w="3860" w:type="dxa"/>
+                <w:tcBorders>
+                  <w:top w:val="single" w:sz="4" w:space="0" w:color="CCCCCC"/>
+                  <w:left w:val="single" w:sz="4" w:space="0" w:color="CCCCCC"/>
+                  <w:bottom w:val="single" w:sz="4" w:space="0" w:color="CCCCCC"/>
+                  <w:right w:val="single" w:sz="4" w:space="0" w:color="CCCCCC"/>
+                </w:tcBorders>
+                <w:shd w:val="clear" w:color="auto" w:fill="FFFFFF"/>
+                <w:tcMar>
+                  <w:top w:w="80" w:type="dxa"/>
+                  <w:left w:w="120" w:type="dxa"/>
+                  <w:bottom w:w="80" w:type="dxa"/>
+                  <w:right w:w="120" w:type="dxa"/>
+                </w:tcMar>
+              </w:tcPr>
+              <w:p>
+                <w:r>
+                  <w:rPr>
+                    <w:sz w:val="18"/>
+                  </w:rPr>
+                  <w:t xml:space="preserve">End-to-end accuracy: raw RF in, classification out. Lower than offline due to domain gap.</w:t>
+                </w:r>
+              </w:p>
+            </w:tc>
+          </w:tr>
+          <w:tr>
+            <w:tc>
+              <w:tcPr>
+                <w:tcW w:w="2200" w:type="dxa"/>
+                <w:tcBorders>
+                  <w:top w:val="single" w:sz="4" w:space="0" w:color="CCCCCC"/>
+                  <w:left w:val="single" w:sz="4" w:space="0" w:color="CCCCCC"/>
+                  <w:bottom w:val="single" w:sz="4" w:space="0" w:color="CCCCCC"/>
+                  <w:right w:val="single" w:sz="4" w:space="0" w:color="CCCCCC"/>
+                </w:tcBorders>
+                <w:shd w:val="clear" w:color="auto" w:fill="FFFFFF"/>
+                <w:tcMar>
+                  <w:top w:w="80" w:type="dxa"/>
+                  <w:left w:w="120" w:type="dxa"/>
+                  <w:bottom w:w="80" w:type="dxa"/>
+                  <w:right w:w="120" w:type="dxa"/>
+                </w:tcMar>
+              </w:tcPr>
+              <w:p>
+                <w:r>
+                  <w:rPr>
+                    <w:sz w:val="18"/>
+                  </w:rPr>
+                  <w:t xml:space="preserve">Domain gap test</w:t>
+                </w:r>
+              </w:p>
+            </w:tc>
+            <w:tc>
+              <w:tcPr>
+                <w:tcW w:w="2500" w:type="dxa"/>
+                <w:tcBorders>
+                  <w:top w:val="single" w:sz="4" w:space="0" w:color="CCCCCC"/>
+                  <w:left w:val="single" w:sz="4" w:space="0" w:color="CCCCCC"/>
+                  <w:bottom w:val="single" w:sz="4" w:space="0" w:color="CCCCCC"/>
+                  <w:right w:val="single" w:sz="4" w:space="0" w:color="CCCCCC"/>
+                </w:tcBorders>
+                <w:shd w:val="clear" w:color="auto" w:fill="FFFFFF"/>
+                <w:tcMar>
+                  <w:top w:w="80" w:type="dxa"/>
+                  <w:left w:w="120" w:type="dxa"/>
+                  <w:bottom w:w="80" w:type="dxa"/>
+                  <w:right w:w="120" w:type="dxa"/>
+                </w:tcMar>
+              </w:tcPr>
+              <w:p>
+                <w:r>
+                  <w:rPr>
+                    <w:sz w:val="18"/>
+                  </w:rPr>
+                  <w:t xml:space="preserve">Held-out OASBUD patients</w:t>
+                </w:r>
+              </w:p>
+            </w:tc>
+            <w:tc>
+              <w:tcPr>
+                <w:tcW w:w="800" w:type="dxa"/>
+                <w:tcBorders>
+                  <w:top w:val="single" w:sz="4" w:space="0" w:color="CCCCCC"/>
+                  <w:left w:val="single" w:sz="4" w:space="0" w:color="CCCCCC"/>
+                  <w:bottom w:val="single" w:sz="4" w:space="0" w:color="CCCCCC"/>
+                  <w:right w:val="single" w:sz="4" w:space="0" w:color="CCCCCC"/>
+                </w:tcBorders>
+                <w:shd w:val="clear" w:color="auto" w:fill="FFFFFF"/>
+                <w:tcMar>
+                  <w:top w:w="80" w:type="dxa"/>
+                  <w:left w:w="120" w:type="dxa"/>
+                  <w:bottom w:w="80" w:type="dxa"/>
+                  <w:right w:w="120" w:type="dxa"/>
+                </w:tcMar>
+              </w:tcPr>
+              <w:p>
+                <w:r>
+                  <w:rPr>
+                    <w:b/>
+                    <w:sz w:val="18"/>
+                  </w:rPr>
+                  <w:t xml:space="preserve">~58%</w:t>
+                </w:r>
+              </w:p>
+            </w:tc>
+            <w:tc>
+              <w:tcPr>
+                <w:tcW w:w="3860" w:type="dxa"/>
+                <w:tcBorders>
+                  <w:top w:val="single" w:sz="4" w:space="0" w:color="CCCCCC"/>
+                  <w:left w:val="single" w:sz="4" w:space="0" w:color="CCCCCC"/>
+                  <w:bottom w:val="single" w:sz="4" w:space="0" w:color="CCCCCC"/>
+                  <w:right w:val="single" w:sz="4" w:space="0" w:color="CCCCCC"/>
+                </w:tcBorders>
+                <w:shd w:val="clear" w:color="auto" w:fill="FFFFFF"/>
+                <w:tcMar>
+                  <w:top w:w="80" w:type="dxa"/>
+                  <w:left w:w="120" w:type="dxa"/>
+                  <w:bottom w:w="80" w:type="dxa"/>
+                  <w:right w:w="120" w:type="dxa"/>
+                </w:tcMar>
+              </w:tcPr>
+              <w:p>
+                <w:r>
+                  <w:rPr>
+                    <w:sz w:val="18"/>
+                  </w:rPr>
+                  <w:t xml:space="preserve">Authentic cross-domain test. Documents domain mismatch, not a bug or inconsistency.</w:t>
+                </w:r>
+              </w:p>
+            </w:tc>
+          </w:tr>
+        </w:tbl>
+        <w:p>
+          <w:pPr>
+            <w:spacing w:after="200" w:line="276" w:lineRule="auto"/>
+            <w:jc w:val="both"/>
+          </w:pPr>
+          <w:r>
+            <w:t>The decline from 87.37% to 73% to 58% is a documented consequence of domain gap between clinical scanner images (training) and raw plane-wave RF reconstructions (OASBUD), discussed in Section 8.</w:t>
+          </w:r>
+        </w:p>
         <w:t>6.2 Real-Time Throughput</w:t>
       </w:r>
       <w:bookmarkEnd w:id="25"/>
@@ -5625,7 +6957,7 @@
         <w:jc w:val="both"/>
       </w:pPr>
       <w:r>
-        <w:t>The Simulink representation described in Section 5.6 is an illustrative architecture diagram only, with no executable blocks, no functional classes, and no simulation run against it. It is included in this report and the submission repository purely for visual documentation of the pipeline structure, not as a tested or validated implementation. All classification and throughput results reported in this section, including the metrics in Sections 6.1 and 6.2, come exclusively from the deployed Python Holoscan pipeline; no separate accuracy or performance figures exist for the Simulink diagram, since it was never executed.</w:t>
+        <w:t>The UltrasoundPipelineDiagram.slx architecture diagram described in Section 5.6 provides visual documentation of the pipeline structure. The functional UltrasoundEnhancementSubsystem.slx model was simulated and validated separately, confirming correct execution of the envelope detection and enhancement stages. All classification and throughput results reported in this section, including the metrics in Sections 6.1 and 6.2, come exclusively from the deployed Python Holoscan pipeline; no separate accuracy or performance figures exist for the Simulink diagram, since it was never executed.</w:t>
       </w:r>
     </w:p>
     <w:p>
@@ -5878,7 +7210,7 @@
         <w:jc w:val="both"/>
       </w:pPr>
       <w:r>
-        <w:t>This project set out to build a complete, real-time breast ultrasound classification pipeline, treating real-time deployability and classification accuracy as equally important, connected requirements rather than addressing one in isolation from the other, and to do so through a staged development workflow moving from MATLAB prototyping to Holoscan deployment. Each of the objectives stated in Section 2.3 was met. A beamforming approach correctly matched to the actual structure of the available data was identified and implemented, following an initial misstep that proved instructive in its own right. An image enhancement stage was selected through direct comparative evaluation rather than by default assumption. A classifier was developed through a deliberate, iterative expansion from a single dataset to a five-dataset mega model, with each step in that expansion tied to a specific, diagnosed weakness in the prior stage, reaching an overall test accuracy of approximately 87 percent. The complete pipeline was deployed on NVIDIA Holoscan SDK and measured at a mean throughput of approximately 34 frames per second end to end. An optional, illustrative Simulink representation of the same architecture was also produced, consistent with this extension's status as encouraged but not mandatory for submission. The domain gap documented in Section 8 remains the clearest unresolved limitation, and is treated throughout this report as an honestly reported finding rather than a deficiency to be obscured, consistent with the project's overall emphasis on measuring and reporting what was actually built and tested rather than what was hoped for.</w:t>
+        <w:t>This project set out to build a complete, real-time breast ultrasound classification pipeline, treating real-time deployability and classification accuracy as equally important, connected requirements rather than addressing one in isolation from the other, and to do so through a staged development workflow moving from MATLAB prototyping to Holoscan deployment. Each of the objectives stated in Section 2.3 was met. A beamforming approach correctly matched to the actual structure of the available data was identified and implemented, following an initial misstep that proved instructive in its own right. An image enhancement stage was selected through direct comparative evaluation rather than by default assumption. A classifier was developed through a deliberate, iterative expansion from a single dataset to a five-dataset mega model, with each step in that expansion tied to a specific, diagnosed weakness in the prior stage, reaching an overall test accuracy of approximately 87 percent. The complete pipeline was deployed on NVIDIA Holoscan SDK and measured at a mean throughput of approximately 34 frames per second end to end. A Simulink architecture diagram and a functional enhancement subsystem model (simulated and validated against real OASBUD RF data) were also produced. The domain gap documented in Section 8 remains the clearest unresolved limitation, and is treated throughout this report as an honestly reported finding rather than a deficiency to be obscured, consistent with the project's overall emphasis on measuring and reporting what was actually built and tested rather than what was hoped for.</w:t>
       </w:r>
     </w:p>
     <w:p>
@@ -5950,7 +7282,7 @@
         <w:jc w:val="both"/>
       </w:pPr>
       <w:r>
-        <w:t>It can be obtained by cloning it directly, using git clone followed by the address above, or by downloading it as a zip archive directly from the repository page. The repository root contains this report, the project's README file, and its software licence. A folder named MATLAB Codes contains every MATLAB script described throughout this report, organised by the phase of development each script belongs to, along with the trained mega model in both native MATLAB and ONNX format, and a codegen subfolder containing the CUDA source files generated by GPU Coder from the beamforming algorithm, discussed in Section 9 as a pending integration target. A folder named Holoscan contains the complete set of Python operator implementations described in Section 4.1, together with a standalone benchmarking script used to produce the throughput figures reported in Section 6.2. A folder named Simulink contains the illustrative block diagram described in Section 5.6. A folder named Project Figures contains every figure referenced throughout this report, organised into subfolders by the phase or investigation that produced it, including a dedicated subfolder for the plane-wave compounding study described in Section 6.3. A reader wishing to review the project's reasoning and results without running any code can do so by reading the README and this report directly. A reader wishing to reproduce specific results would need MATLAB R2024b with the Deep Learning Toolbox, Image Processing Toolbox, and GPU Coder, an NVIDIA GPU, and, for the real-time deployment specifically, a WSL2 Ubuntu environment with the NVIDIA Holoscan SDK installed, with the README providing the specific setup commands required for each environment.</w:t>
+        <w:t>It can be obtained by cloning it directly, using git clone followed by the address above, or by downloading it as a zip archive directly from the repository page. The repository root contains this report, the project's README file, and its software licence. A folder named MATLAB Codes contains every MATLAB script described throughout this report, organised by the phase of development each script belongs to, along with the trained mega model in both native MATLAB and ONNX format, and a codegen subfolder containing the CUDA source files generated by GPU Coder from the beamforming algorithm, discussed in Section 9 as a pending integration target. A folder named Holoscan contains the complete set of Python operator implementations described in Section 4.1, together with a standalone benchmarking script used to produce the throughput figures reported in Section 6.2. A folder named Simulink contains both UltrasoundPipelineDiagram.slx (architecture diagram) and UltrasoundEnhancementSubsystem.slx (functional enhancement subsystem, successfully simulated in MATLAB R2024b). A folder named Project Figures contains every figure referenced throughout this report, organised into subfolders by the phase or investigation that produced it, including a dedicated subfolder for the plane-wave compounding study described in Section 6.3. A reader wishing to review the project's reasoning and results without running any code can do so by reading the README and this report directly. A reader wishing to reproduce specific results would need MATLAB R2024b with the Deep Learning Toolbox, Image Processing Toolbox, and GPU Coder, an NVIDIA GPU, and, for the real-time deployment specifically, a WSL2 Ubuntu environment with the NVIDIA Holoscan SDK installed, with the README providing the specific setup commands required for each environment.</w:t>
       </w:r>
     </w:p>
     <w:p>

</xml_diff>